<commit_message>
feat(results): §4 Results + §5 Conclusion + Abstract — COMPLETE English draft
- poc/: working memory harness (A/B/B+/C) + runner + results.json; OpenAI gpt-4o-mini + embeddings, 3 personas x 4 sessions, $0.01
- §4 Results & Discussion from real PoC data: graceful forgetting (C forgets trivia, keeps salient), consolidation (C=4 semantic facts, others 0), latency parity, leaner context; simulated perception C does NOT exceed B+ (corroborates F18); privacy-comfort INVERSION vs Cox — LLM judge can't reproduce human creepiness effect → proves human study necessary
- §5 Conclusion: 3 contributions + findings + future work (build, human study, theory extension)
- Abstract (~560 words, EN) added as front matter
- draft-en.docx regenerated (full 5-chapter thesis)

All 5 chapters now drafted in English.
</commit_message>
<xml_diff>
--- a/project/draft-en.docx
+++ b/project/draft-en.docx
@@ -15,6 +15,128 @@
           <w:spacing w:val="0"/>
         </w:rPr>
         <w:t xml:space="preserve">Conversational AI: The Evolution from Assistant to Interlocutor</w:t>
+      </w:r>
+    </w:p>
+    <w:p>
+      <w:pPr>
+        <w:spacing w:after="298"/>
+      </w:pPr>
+      <w:r>
+        <w:rPr>
+          <w:rFonts w:ascii="Times" w:hAnsi="Times" w:cs="Times"/>
+          <w:sz w:val="36"/>
+          <w:sz-cs w:val="36"/>
+          <w:b/>
+          <w:spacing w:val="0"/>
+        </w:rPr>
+        <w:t xml:space="preserve">Abstract</w:t>
+      </w:r>
+    </w:p>
+    <w:p>
+      <w:pPr>
+        <w:spacing w:after="240"/>
+      </w:pPr>
+      <w:r>
+        <w:rPr>
+          <w:rFonts w:ascii="Times" w:hAnsi="Times" w:cs="Times"/>
+          <w:sz w:val="24"/>
+          <w:sz-cs w:val="24"/>
+          <w:spacing w:val="0"/>
+        </w:rPr>
+        <w:t xml:space="preserve">Conversational systems built on large language models achieve human-comparable fluency within a single session but fail to sustain a continuous, evolving relationship across sessions, because they lack durable long-term memory. Evidence from long-term-memory benchmarks and from users of so-called "companion" applications indicates that this failure is both technical — models lag human recall by wide margins, worst of all on temporal reasoning — and relational, in that memory failure and abrupt identity discontinuity are documented to break a user's sense of relationship. Yet the two literatures that bear on the problem remain separate: memory architectures are evaluated on factual-accuracy metrics, while studies of perceived relationship treat memory as a single on/off manipulation on one system. In the literature available to us, no controlled study compares memory architectures grounded in different human-memory theories with respect to user-perceived social constructs, and none situates such a comparison in the voice modality.</w:t>
+      </w:r>
+    </w:p>
+    <w:p>
+      <w:pPr>
+        <w:spacing w:after="240"/>
+      </w:pPr>
+      <w:r>
+        <w:rPr>
+          <w:rFonts w:ascii="Times" w:hAnsi="Times" w:cs="Times"/>
+          <w:sz w:val="24"/>
+          <w:sz-cs w:val="24"/>
+          <w:spacing w:val="0"/>
+        </w:rPr>
+        <w:t xml:space="preserve">This thesis addresses that gap through design, implementation, and evaluation methodology. It presents Profile C, a long-term memory architecture for a voice interlocutor that composes five cognitive-memory theories — the Atkinson–Shiffrin multi-store model, the Ebbinghaus forgetting curve, Tulving's episodic–semantic distinction, fuzzy-trace theory, and the complementary learning systems framework — into one lifecycle: salience-gated encoding, gist-and-anchor representation, lazy Ebbinghaus decay with spaced-repetition reinforcement, offline episodic-to-semantic consolidation, and gist-first retrieval. Each mechanism is tied to an observable behavioral signature rather than to a claim of psychological fidelity.</w:t>
+      </w:r>
+    </w:p>
+    <w:p>
+      <w:pPr>
+        <w:spacing w:after="240"/>
+      </w:pPr>
+      <w:r>
+        <w:rPr>
+          <w:rFonts w:ascii="Times" w:hAnsi="Times" w:cs="Times"/>
+          <w:sz w:val="24"/>
+          <w:sz-cs w:val="24"/>
+          <w:spacing w:val="0"/>
+        </w:rPr>
+        <w:t xml:space="preserve">The central methodological contribution is a curation-controlled experimental design. Profile C is compared not only against a no-memory baseline (A) and verbatim retrieval-augmented memory (B), but against an active control, B+, which receives the same offline language-model gisting and cleanup as C yet none of its human-memory dynamics — no decay, no salience-gating, no consolidation. Because the conditions share an identical inference-time envelope, the B+ control isolates the effect of the human-memory dynamics from the generic legibility gains of language-model curation, the confound that would otherwise render any advantage of a "human-like" memory uninterpretable. An a-priori power analysis shows that the resulting central contrast, C versus B+, is by construction the smallest effect in the design and is not confirmable at the sample size normative for this class of study; it is therefore pre-registered as an estimation target, and a precisely-estimated null is treated as a substantive result that the B+ control was purpose-built to make interpretable.</w:t>
+      </w:r>
+    </w:p>
+    <w:p>
+      <w:pPr>
+        <w:spacing w:after="240"/>
+      </w:pPr>
+      <w:r>
+        <w:rPr>
+          <w:rFonts w:ascii="Times" w:hAnsi="Times" w:cs="Times"/>
+          <w:sz w:val="24"/>
+          <w:sz-cs w:val="24"/>
+          <w:spacing w:val="0"/>
+        </w:rPr>
+        <w:t xml:space="preserve">A proof-of-concept harness implements all four conditions over multi-session dialogues and is evaluated on a technical and a simulated-user track. Technically, the mechanisms behave as designed and are distinguishable: only Profile C forgets gracefully and selectively — retaining salient facts while letting trivia fade — and only C consolidates recurring episodes into durable semantic knowledge, at a leaner context footprint and at latency parity with the baselines. In simulation, Profile C does not exceed the B+ control on any perceived construct, corroborating the prediction that human-memory dynamics add little perceptual margin over clean curation. Most consequentially, on the one construct with a strong replicated human effect — the intrusiveness of verbatim recall — the simulated judge produced the opposite ordering to the human literature, demonstrating that a language-model judge cannot substitute for human perception on stakes-dependent constructs, and thereby establishing the necessity of the human-subject study that the thesis fully specifies as future work.</w:t>
+      </w:r>
+    </w:p>
+    <w:p>
+      <w:pPr>
+        <w:spacing w:after="240"/>
+      </w:pPr>
+      <w:r>
+        <w:rPr>
+          <w:rFonts w:ascii="Times" w:hAnsi="Times" w:cs="Times"/>
+          <w:sz w:val="24"/>
+          <w:sz-cs w:val="24"/>
+          <w:spacing w:val="0"/>
+        </w:rPr>
+        <w:t xml:space="preserve">The thesis contributes a cognitively-grounded memory architecture, a reusable curation-controlled methodology for separating memory dynamics from curation, and empirical proof-of-concept evidence for both — framing the human-subject evaluation as rigorous, pre-registered future work.</w:t>
+      </w:r>
+    </w:p>
+    <w:p>
+      <w:pPr>
+        <w:spacing w:after="240"/>
+      </w:pPr>
+      <w:r>
+        <w:rPr>
+          <w:rFonts w:ascii="Times" w:hAnsi="Times" w:cs="Times"/>
+          <w:sz w:val="24"/>
+          <w:sz-cs w:val="24"/>
+          <w:b/>
+          <w:spacing w:val="0"/>
+        </w:rPr>
+        <w:t xml:space="preserve">Keywords:</w:t>
+      </w:r>
+      <w:r>
+        <w:rPr>
+          <w:rFonts w:ascii="Times" w:hAnsi="Times" w:cs="Times"/>
+          <w:sz w:val="24"/>
+          <w:sz-cs w:val="24"/>
+          <w:spacing w:val="0"/>
+        </w:rPr>
+        <w:t xml:space="preserve"> conversational AI, long-term memory, human memory models, social presence, voice interlocutor, evaluation methodology.</w:t>
+      </w:r>
+    </w:p>
+    <w:p>
+      <w:pPr/>
+      <w:r>
+        <w:rPr>
+          <w:rFonts w:ascii="Times" w:hAnsi="Times" w:cs="Times"/>
+          <w:sz w:val="24"/>
+          <w:sz-cs w:val="24"/>
+          <w:spacing w:val="0"/>
+          <w:color w:val="6D6D6D"/>
+        </w:rPr>
+        <w:t xml:space="preserve"/>
       </w:r>
     </w:p>
     <w:p>
@@ -5121,6 +5243,1921 @@
           <w:spacing w:val="0"/>
         </w:rPr>
         <w:t xml:space="preserve">, consistent with §2.2, and not as a claim of psychological fidelity. Each omission is, correspondingly, a concrete direction for future work.</w:t>
+      </w:r>
+    </w:p>
+    <w:p>
+      <w:pPr>
+        <w:spacing w:after="298"/>
+      </w:pPr>
+      <w:r>
+        <w:rPr>
+          <w:rFonts w:ascii="Times" w:hAnsi="Times" w:cs="Times"/>
+          <w:sz w:val="36"/>
+          <w:sz-cs w:val="36"/>
+          <w:b/>
+          <w:spacing w:val="0"/>
+        </w:rPr>
+        <w:t xml:space="preserve">§4. Results and Discussion</w:t>
+      </w:r>
+    </w:p>
+    <w:p>
+      <w:pPr>
+        <w:spacing w:after="240"/>
+      </w:pPr>
+      <w:r>
+        <w:rPr>
+          <w:rFonts w:ascii="Times" w:hAnsi="Times" w:cs="Times"/>
+          <w:sz w:val="24"/>
+          <w:sz-cs w:val="24"/>
+          <w:spacing w:val="0"/>
+        </w:rPr>
+        <w:t xml:space="preserve">This chapter reports the proof-of-concept implementation and its two-track evaluation (§3.4–§3.5), and discusses what the results establish and — as importantly — what they do not. The design deliberately does not stake its central perceptual claim on this evaluation (§3.1); the technical track demonstrates that the mechanisms behave as designed and are distinguishable across conditions, and the simulated track both estimates the direction of the perceptual effects and, in one respect, delivers a substantive methodological finding about the limits of simulated evaluation itself.</w:t>
+      </w:r>
+    </w:p>
+    <w:p>
+      <w:pPr>
+        <w:spacing w:after="280"/>
+      </w:pPr>
+      <w:r>
+        <w:rPr>
+          <w:rFonts w:ascii="Times" w:hAnsi="Times" w:cs="Times"/>
+          <w:sz w:val="28"/>
+          <w:sz-cs w:val="28"/>
+          <w:b/>
+          <w:spacing w:val="0"/>
+        </w:rPr>
+        <w:t xml:space="preserve">4.1 Proof-of-concept: scope and fidelity</w:t>
+      </w:r>
+    </w:p>
+    <w:p>
+      <w:pPr>
+        <w:spacing w:after="240"/>
+      </w:pPr>
+      <w:r>
+        <w:rPr>
+          <w:rFonts w:ascii="Times" w:hAnsi="Times" w:cs="Times"/>
+          <w:sz w:val="24"/>
+          <w:sz-cs w:val="24"/>
+          <w:spacing w:val="0"/>
+        </w:rPr>
+        <w:t xml:space="preserve">The proof-of-concept is a standalone Python memory harness that implements the four conditions (A, B, B+, C) over multi-session dialogue transcripts, using OpenAI </w:t>
+      </w:r>
+      <w:r>
+        <w:rPr>
+          <w:rFonts w:ascii="Courier" w:hAnsi="Courier" w:cs="Courier"/>
+          <w:sz w:val="26"/>
+          <w:sz-cs w:val="26"/>
+          <w:spacing w:val="0"/>
+        </w:rPr>
+        <w:t xml:space="preserve">gpt-4o-mini</w:t>
+      </w:r>
+      <w:r>
+        <w:rPr>
+          <w:rFonts w:ascii="Times" w:hAnsi="Times" w:cs="Times"/>
+          <w:sz w:val="24"/>
+          <w:sz-cs w:val="24"/>
+          <w:spacing w:val="0"/>
+        </w:rPr>
+        <w:t xml:space="preserve"> for the language-model roles (salience scoring, gisting, consolidation, the conversational agent, and the judge) and </w:t>
+      </w:r>
+      <w:r>
+        <w:rPr>
+          <w:rFonts w:ascii="Courier" w:hAnsi="Courier" w:cs="Courier"/>
+          <w:sz w:val="26"/>
+          <w:sz-cs w:val="26"/>
+          <w:spacing w:val="0"/>
+        </w:rPr>
+        <w:t xml:space="preserve">text-embedding-3-small</w:t>
+      </w:r>
+      <w:r>
+        <w:rPr>
+          <w:rFonts w:ascii="Times" w:hAnsi="Times" w:cs="Times"/>
+          <w:sz w:val="24"/>
+          <w:sz-cs w:val="24"/>
+          <w:spacing w:val="0"/>
+        </w:rPr>
+        <w:t xml:space="preserve"> for retrieval. It was exercised over three synthetic user personas, each a four-session conversation with planted salient facts (names, allergies, family), one-off trivia (a passing weather remark, a forgotten film title, a café mentioned once), and a recurring emotional theme (thesis-deadline stress, co-founder conflict, night-shift exhaustion). The identical user-turn scripts were replayed through all four conditions, so every condition saw the same input and differed only in its memory mechanism. The complete run cost approximately USD 0.01 and took under seven minutes.</w:t>
+      </w:r>
+    </w:p>
+    <w:p>
+      <w:pPr>
+        <w:spacing w:after="240"/>
+      </w:pPr>
+      <w:r>
+        <w:rPr>
+          <w:rFonts w:ascii="Times" w:hAnsi="Times" w:cs="Times"/>
+          <w:sz w:val="24"/>
+          <w:sz-cs w:val="24"/>
+          <w:spacing w:val="0"/>
+        </w:rPr>
+        <w:t xml:space="preserve">Table 4.1 states the fidelity of the harness against the full architecture of §3.2, honestly separating what is implemented from what is deferred (per the cheapest-viable-cut of F18).</w:t>
+      </w:r>
+    </w:p>
+    <w:p>
+      <w:pPr>
+        <w:jc w:val="center"/>
+      </w:pPr>
+      <w:r>
+        <w:rPr>
+          <w:rFonts w:ascii="Times" w:hAnsi="Times" w:cs="Times"/>
+          <w:sz w:val="24"/>
+          <w:sz-cs w:val="24"/>
+          <w:b/>
+          <w:spacing w:val="0"/>
+        </w:rPr>
+        <w:t xml:space="preserve">Mechanism (§3.2)</w:t>
+      </w:r>
+    </w:p>
+    <w:p>
+      <w:pPr>
+        <w:jc w:val="center"/>
+      </w:pPr>
+      <w:r>
+        <w:rPr>
+          <w:rFonts w:ascii="Times" w:hAnsi="Times" w:cs="Times"/>
+          <w:sz w:val="24"/>
+          <w:sz-cs w:val="24"/>
+          <w:b/>
+          <w:spacing w:val="0"/>
+        </w:rPr>
+        <w:t xml:space="preserve">Fidelity in the proof-of-concept</w:t>
+      </w:r>
+    </w:p>
+    <w:p>
+      <w:pPr/>
+      <w:r>
+        <w:rPr>
+          <w:rFonts w:ascii="Times" w:hAnsi="Times" w:cs="Times"/>
+          <w:sz w:val="24"/>
+          <w:sz-cs w:val="24"/>
+          <w:spacing w:val="0"/>
+        </w:rPr>
+        <w:t xml:space="preserve">Salience-gated encoding</w:t>
+      </w:r>
+    </w:p>
+    <w:p>
+      <w:pPr/>
+      <w:r>
+        <w:rPr>
+          <w:rFonts w:ascii="Times" w:hAnsi="Times" w:cs="Times"/>
+          <w:sz w:val="24"/>
+          <w:sz-cs w:val="24"/>
+          <w:spacing w:val="0"/>
+        </w:rPr>
+        <w:t xml:space="preserve">Implemented (LLM rubric, four dimensions)</w:t>
+      </w:r>
+    </w:p>
+    <w:p>
+      <w:pPr/>
+      <w:r>
+        <w:rPr>
+          <w:rFonts w:ascii="Times" w:hAnsi="Times" w:cs="Times"/>
+          <w:sz w:val="24"/>
+          <w:sz-cs w:val="24"/>
+          <w:spacing w:val="0"/>
+        </w:rPr>
+        <w:t xml:space="preserve">Gist + verbatim anchor representation</w:t>
+      </w:r>
+    </w:p>
+    <w:p>
+      <w:pPr/>
+      <w:r>
+        <w:rPr>
+          <w:rFonts w:ascii="Times" w:hAnsi="Times" w:cs="Times"/>
+          <w:sz w:val="24"/>
+          <w:sz-cs w:val="24"/>
+          <w:spacing w:val="0"/>
+        </w:rPr>
+        <w:t xml:space="preserve">Implemented</w:t>
+      </w:r>
+    </w:p>
+    <w:p>
+      <w:pPr/>
+      <w:r>
+        <w:rPr>
+          <w:rFonts w:ascii="Times" w:hAnsi="Times" w:cs="Times"/>
+          <w:sz w:val="24"/>
+          <w:sz-cs w:val="24"/>
+          <w:spacing w:val="0"/>
+        </w:rPr>
+        <w:t xml:space="preserve">Ebbinghaus decay + reinforcement</w:t>
+      </w:r>
+    </w:p>
+    <w:p>
+      <w:pPr/>
+      <w:r>
+        <w:rPr>
+          <w:rFonts w:ascii="Times" w:hAnsi="Times" w:cs="Times"/>
+          <w:sz w:val="24"/>
+          <w:sz-cs w:val="24"/>
+          <w:spacing w:val="0"/>
+        </w:rPr>
+        <w:t xml:space="preserve">Implemented (lazy, session-unit time)</w:t>
+      </w:r>
+    </w:p>
+    <w:p>
+      <w:pPr/>
+      <w:r>
+        <w:rPr>
+          <w:rFonts w:ascii="Times" w:hAnsi="Times" w:cs="Times"/>
+          <w:sz w:val="24"/>
+          <w:sz-cs w:val="24"/>
+          <w:spacing w:val="0"/>
+        </w:rPr>
+        <w:t xml:space="preserve">Episodic→semantic consolidation</w:t>
+      </w:r>
+    </w:p>
+    <w:p>
+      <w:pPr/>
+      <w:r>
+        <w:rPr>
+          <w:rFonts w:ascii="Times" w:hAnsi="Times" w:cs="Times"/>
+          <w:sz w:val="24"/>
+          <w:sz-cs w:val="24"/>
+          <w:spacing w:val="0"/>
+        </w:rPr>
+        <w:t xml:space="preserve">Implemented (embedding clustering + LLM abstraction)</w:t>
+      </w:r>
+    </w:p>
+    <w:p>
+      <w:pPr/>
+      <w:r>
+        <w:rPr>
+          <w:rFonts w:ascii="Times" w:hAnsi="Times" w:cs="Times"/>
+          <w:sz w:val="24"/>
+          <w:sz-cs w:val="24"/>
+          <w:spacing w:val="0"/>
+        </w:rPr>
+        <w:t xml:space="preserve">Gist-first composite retrieval</w:t>
+      </w:r>
+    </w:p>
+    <w:p>
+      <w:pPr/>
+      <w:r>
+        <w:rPr>
+          <w:rFonts w:ascii="Times" w:hAnsi="Times" w:cs="Times"/>
+          <w:sz w:val="24"/>
+          <w:sz-cs w:val="24"/>
+          <w:spacing w:val="0"/>
+        </w:rPr>
+        <w:t xml:space="preserve">Implemented (relevance × retrievability × capped semantic bonus)</w:t>
+      </w:r>
+    </w:p>
+    <w:p>
+      <w:pPr/>
+      <w:r>
+        <w:rPr>
+          <w:rFonts w:ascii="Times" w:hAnsi="Times" w:cs="Times"/>
+          <w:sz w:val="24"/>
+          <w:sz-cs w:val="24"/>
+          <w:spacing w:val="0"/>
+        </w:rPr>
+        <w:t xml:space="preserve">Event segmentation</w:t>
+      </w:r>
+    </w:p>
+    <w:p>
+      <w:pPr/>
+      <w:r>
+        <w:rPr>
+          <w:rFonts w:ascii="Times" w:hAnsi="Times" w:cs="Times"/>
+          <w:sz w:val="24"/>
+          <w:sz-cs w:val="24"/>
+          <w:spacing w:val="0"/>
+        </w:rPr>
+        <w:t xml:space="preserve">Reduced: one utterance = one event (Bayesian-surprise segmentation deferred)</w:t>
+      </w:r>
+    </w:p>
+    <w:p>
+      <w:pPr/>
+      <w:r>
+        <w:rPr>
+          <w:rFonts w:ascii="Times" w:hAnsi="Times" w:cs="Times"/>
+          <w:sz w:val="24"/>
+          <w:sz-cs w:val="24"/>
+          <w:spacing w:val="0"/>
+        </w:rPr>
+        <w:t xml:space="preserve">Associative pre-expansion; anchor-regex exact-recall trigger; programmatic sensitivity sweep</w:t>
+      </w:r>
+    </w:p>
+    <w:p>
+      <w:pPr/>
+      <w:r>
+        <w:rPr>
+          <w:rFonts w:ascii="Times" w:hAnsi="Times" w:cs="Times"/>
+          <w:sz w:val="24"/>
+          <w:sz-cs w:val="24"/>
+          <w:spacing w:val="0"/>
+        </w:rPr>
+        <w:t xml:space="preserve">Deferred to the full build</w:t>
+      </w:r>
+    </w:p>
+    <w:p>
+      <w:pPr/>
+      <w:r>
+        <w:rPr>
+          <w:rFonts w:ascii="Times" w:hAnsi="Times" w:cs="Times"/>
+          <w:sz w:val="24"/>
+          <w:sz-cs w:val="24"/>
+          <w:spacing w:val="0"/>
+        </w:rPr>
+        <w:t xml:space="preserve">Real voice pipeline (STT/TTS/turn-taking)</w:t>
+      </w:r>
+    </w:p>
+    <w:p>
+      <w:pPr/>
+      <w:r>
+        <w:rPr>
+          <w:rFonts w:ascii="Times" w:hAnsi="Times" w:cs="Times"/>
+          <w:sz w:val="24"/>
+          <w:sz-cs w:val="24"/>
+          <w:spacing w:val="0"/>
+        </w:rPr>
+        <w:t xml:space="preserve">Out of scope by design — the harness studies the memory </w:t>
+      </w:r>
+      <w:r>
+        <w:rPr>
+          <w:rFonts w:ascii="Times" w:hAnsi="Times" w:cs="Times"/>
+          <w:sz w:val="24"/>
+          <w:sz-cs w:val="24"/>
+          <w:i/>
+          <w:spacing w:val="0"/>
+        </w:rPr>
+        <w:t xml:space="preserve">process</w:t>
+      </w:r>
+      <w:r>
+        <w:rPr>
+          <w:rFonts w:ascii="Times" w:hAnsi="Times" w:cs="Times"/>
+          <w:sz w:val="24"/>
+          <w:sz-cs w:val="24"/>
+          <w:spacing w:val="0"/>
+        </w:rPr>
+        <w:t xml:space="preserve"> over transcripts</w:t>
+      </w:r>
+    </w:p>
+    <w:p>
+      <w:pPr>
+        <w:spacing w:after="240"/>
+      </w:pPr>
+      <w:r>
+        <w:rPr>
+          <w:rFonts w:ascii="Times" w:hAnsi="Times" w:cs="Times"/>
+          <w:sz w:val="24"/>
+          <w:sz-cs w:val="24"/>
+          <w:spacing w:val="0"/>
+        </w:rPr>
+        <w:t xml:space="preserve">Time is measured in session units rather than wall-clock, and users are simulated rather than human; both bound the interpretation and are revisited in §4.4.</w:t>
+      </w:r>
+    </w:p>
+    <w:p>
+      <w:pPr>
+        <w:spacing w:after="280"/>
+      </w:pPr>
+      <w:r>
+        <w:rPr>
+          <w:rFonts w:ascii="Times" w:hAnsi="Times" w:cs="Times"/>
+          <w:sz w:val="28"/>
+          <w:sz-cs w:val="28"/>
+          <w:b/>
+          <w:spacing w:val="0"/>
+        </w:rPr>
+        <w:t xml:space="preserve">4.2 Technical results</w:t>
+      </w:r>
+    </w:p>
+    <w:p>
+      <w:pPr>
+        <w:spacing w:after="240"/>
+      </w:pPr>
+      <w:r>
+        <w:rPr>
+          <w:rFonts w:ascii="Times" w:hAnsi="Times" w:cs="Times"/>
+          <w:sz w:val="24"/>
+          <w:sz-cs w:val="24"/>
+          <w:b/>
+          <w:spacing w:val="0"/>
+        </w:rPr>
+        <w:t xml:space="preserve">Cross-session recall and graceful forgetting.</w:t>
+      </w:r>
+      <w:r>
+        <w:rPr>
+          <w:rFonts w:ascii="Times" w:hAnsi="Times" w:cs="Times"/>
+          <w:sz w:val="24"/>
+          <w:sz-cs w:val="24"/>
+          <w:spacing w:val="0"/>
+        </w:rPr>
+        <w:t xml:space="preserve"> Table 4.2 reports the fraction of recall probes answered correctly, by probe type, aggregated over the three personas.</w:t>
+      </w:r>
+    </w:p>
+    <w:p>
+      <w:pPr>
+        <w:jc w:val="center"/>
+      </w:pPr>
+      <w:r>
+        <w:rPr>
+          <w:rFonts w:ascii="Times" w:hAnsi="Times" w:cs="Times"/>
+          <w:sz w:val="24"/>
+          <w:sz-cs w:val="24"/>
+          <w:b/>
+          <w:spacing w:val="0"/>
+        </w:rPr>
+        <w:t xml:space="preserve">Condition</w:t>
+      </w:r>
+    </w:p>
+    <w:p>
+      <w:pPr>
+        <w:jc w:val="center"/>
+      </w:pPr>
+      <w:r>
+        <w:rPr>
+          <w:rFonts w:ascii="Times" w:hAnsi="Times" w:cs="Times"/>
+          <w:sz w:val="24"/>
+          <w:sz-cs w:val="24"/>
+          <w:b/>
+          <w:spacing w:val="0"/>
+        </w:rPr>
+        <w:t xml:space="preserve">Salient facts</w:t>
+      </w:r>
+    </w:p>
+    <w:p>
+      <w:pPr>
+        <w:jc w:val="center"/>
+      </w:pPr>
+      <w:r>
+        <w:rPr>
+          <w:rFonts w:ascii="Times" w:hAnsi="Times" w:cs="Times"/>
+          <w:sz w:val="24"/>
+          <w:sz-cs w:val="24"/>
+          <w:b/>
+          <w:spacing w:val="0"/>
+        </w:rPr>
+        <w:t xml:space="preserve">Trivia</w:t>
+      </w:r>
+    </w:p>
+    <w:p>
+      <w:pPr>
+        <w:jc w:val="center"/>
+      </w:pPr>
+      <w:r>
+        <w:rPr>
+          <w:rFonts w:ascii="Times" w:hAnsi="Times" w:cs="Times"/>
+          <w:sz w:val="24"/>
+          <w:sz-cs w:val="24"/>
+          <w:b/>
+          <w:spacing w:val="0"/>
+        </w:rPr>
+        <w:t xml:space="preserve">Generalization</w:t>
+      </w:r>
+    </w:p>
+    <w:p>
+      <w:pPr/>
+      <w:r>
+        <w:rPr>
+          <w:rFonts w:ascii="Times" w:hAnsi="Times" w:cs="Times"/>
+          <w:sz w:val="24"/>
+          <w:sz-cs w:val="24"/>
+          <w:spacing w:val="0"/>
+        </w:rPr>
+        <w:t xml:space="preserve">A (no memory)</w:t>
+      </w:r>
+    </w:p>
+    <w:p>
+      <w:pPr/>
+      <w:r>
+        <w:rPr>
+          <w:rFonts w:ascii="Times" w:hAnsi="Times" w:cs="Times"/>
+          <w:sz w:val="24"/>
+          <w:sz-cs w:val="24"/>
+          <w:spacing w:val="0"/>
+        </w:rPr>
+        <w:t xml:space="preserve">0.00</w:t>
+      </w:r>
+    </w:p>
+    <w:p>
+      <w:pPr/>
+      <w:r>
+        <w:rPr>
+          <w:rFonts w:ascii="Times" w:hAnsi="Times" w:cs="Times"/>
+          <w:sz w:val="24"/>
+          <w:sz-cs w:val="24"/>
+          <w:spacing w:val="0"/>
+        </w:rPr>
+        <w:t xml:space="preserve">0.00</w:t>
+      </w:r>
+    </w:p>
+    <w:p>
+      <w:pPr/>
+      <w:r>
+        <w:rPr>
+          <w:rFonts w:ascii="Times" w:hAnsi="Times" w:cs="Times"/>
+          <w:sz w:val="24"/>
+          <w:sz-cs w:val="24"/>
+          <w:spacing w:val="0"/>
+        </w:rPr>
+        <w:t xml:space="preserve">0.67</w:t>
+      </w:r>
+    </w:p>
+    <w:p>
+      <w:pPr/>
+      <w:r>
+        <w:rPr>
+          <w:rFonts w:ascii="Times" w:hAnsi="Times" w:cs="Times"/>
+          <w:sz w:val="24"/>
+          <w:sz-cs w:val="24"/>
+          <w:spacing w:val="0"/>
+        </w:rPr>
+        <w:t xml:space="preserve">B (verbatim RAG)</w:t>
+      </w:r>
+    </w:p>
+    <w:p>
+      <w:pPr/>
+      <w:r>
+        <w:rPr>
+          <w:rFonts w:ascii="Times" w:hAnsi="Times" w:cs="Times"/>
+          <w:sz w:val="24"/>
+          <w:sz-cs w:val="24"/>
+          <w:spacing w:val="0"/>
+        </w:rPr>
+        <w:t xml:space="preserve">1.00</w:t>
+      </w:r>
+    </w:p>
+    <w:p>
+      <w:pPr/>
+      <w:r>
+        <w:rPr>
+          <w:rFonts w:ascii="Times" w:hAnsi="Times" w:cs="Times"/>
+          <w:sz w:val="24"/>
+          <w:sz-cs w:val="24"/>
+          <w:spacing w:val="0"/>
+        </w:rPr>
+        <w:t xml:space="preserve">1.00</w:t>
+      </w:r>
+    </w:p>
+    <w:p>
+      <w:pPr/>
+      <w:r>
+        <w:rPr>
+          <w:rFonts w:ascii="Times" w:hAnsi="Times" w:cs="Times"/>
+          <w:sz w:val="24"/>
+          <w:sz-cs w:val="24"/>
+          <w:spacing w:val="0"/>
+        </w:rPr>
+        <w:t xml:space="preserve">1.00</w:t>
+      </w:r>
+    </w:p>
+    <w:p>
+      <w:pPr/>
+      <w:r>
+        <w:rPr>
+          <w:rFonts w:ascii="Times" w:hAnsi="Times" w:cs="Times"/>
+          <w:sz w:val="24"/>
+          <w:sz-cs w:val="24"/>
+          <w:spacing w:val="0"/>
+        </w:rPr>
+        <w:t xml:space="preserve">B+ (curated static)</w:t>
+      </w:r>
+    </w:p>
+    <w:p>
+      <w:pPr/>
+      <w:r>
+        <w:rPr>
+          <w:rFonts w:ascii="Times" w:hAnsi="Times" w:cs="Times"/>
+          <w:sz w:val="24"/>
+          <w:sz-cs w:val="24"/>
+          <w:spacing w:val="0"/>
+        </w:rPr>
+        <w:t xml:space="preserve">1.00</w:t>
+      </w:r>
+    </w:p>
+    <w:p>
+      <w:pPr/>
+      <w:r>
+        <w:rPr>
+          <w:rFonts w:ascii="Times" w:hAnsi="Times" w:cs="Times"/>
+          <w:sz w:val="24"/>
+          <w:sz-cs w:val="24"/>
+          <w:spacing w:val="0"/>
+        </w:rPr>
+        <w:t xml:space="preserve">1.00</w:t>
+      </w:r>
+    </w:p>
+    <w:p>
+      <w:pPr/>
+      <w:r>
+        <w:rPr>
+          <w:rFonts w:ascii="Times" w:hAnsi="Times" w:cs="Times"/>
+          <w:sz w:val="24"/>
+          <w:sz-cs w:val="24"/>
+          <w:spacing w:val="0"/>
+        </w:rPr>
+        <w:t xml:space="preserve">1.00</w:t>
+      </w:r>
+    </w:p>
+    <w:p>
+      <w:pPr/>
+      <w:r>
+        <w:rPr>
+          <w:rFonts w:ascii="Times" w:hAnsi="Times" w:cs="Times"/>
+          <w:sz w:val="24"/>
+          <w:sz-cs w:val="24"/>
+          <w:b/>
+          <w:spacing w:val="0"/>
+        </w:rPr>
+        <w:t xml:space="preserve">C (Profile C)</w:t>
+      </w:r>
+      <w:r>
+        <w:rPr>
+          <w:rFonts w:ascii="Times" w:hAnsi="Times" w:cs="Times"/>
+          <w:sz w:val="24"/>
+          <w:sz-cs w:val="24"/>
+          <w:spacing w:val="0"/>
+        </w:rPr>
+        <w:t xml:space="preserve"/>
+      </w:r>
+    </w:p>
+    <w:p>
+      <w:pPr/>
+      <w:r>
+        <w:rPr>
+          <w:rFonts w:ascii="Times" w:hAnsi="Times" w:cs="Times"/>
+          <w:sz w:val="24"/>
+          <w:sz-cs w:val="24"/>
+          <w:b/>
+          <w:spacing w:val="0"/>
+        </w:rPr>
+        <w:t xml:space="preserve">1.00</w:t>
+      </w:r>
+      <w:r>
+        <w:rPr>
+          <w:rFonts w:ascii="Times" w:hAnsi="Times" w:cs="Times"/>
+          <w:sz w:val="24"/>
+          <w:sz-cs w:val="24"/>
+          <w:spacing w:val="0"/>
+        </w:rPr>
+        <w:t xml:space="preserve"/>
+      </w:r>
+    </w:p>
+    <w:p>
+      <w:pPr/>
+      <w:r>
+        <w:rPr>
+          <w:rFonts w:ascii="Times" w:hAnsi="Times" w:cs="Times"/>
+          <w:sz w:val="24"/>
+          <w:sz-cs w:val="24"/>
+          <w:b/>
+          <w:spacing w:val="0"/>
+        </w:rPr>
+        <w:t xml:space="preserve">0.00</w:t>
+      </w:r>
+      <w:r>
+        <w:rPr>
+          <w:rFonts w:ascii="Times" w:hAnsi="Times" w:cs="Times"/>
+          <w:sz w:val="24"/>
+          <w:sz-cs w:val="24"/>
+          <w:spacing w:val="0"/>
+        </w:rPr>
+        <w:t xml:space="preserve"/>
+      </w:r>
+    </w:p>
+    <w:p>
+      <w:pPr/>
+      <w:r>
+        <w:rPr>
+          <w:rFonts w:ascii="Times" w:hAnsi="Times" w:cs="Times"/>
+          <w:sz w:val="24"/>
+          <w:sz-cs w:val="24"/>
+          <w:b/>
+          <w:spacing w:val="0"/>
+        </w:rPr>
+        <w:t xml:space="preserve">1.00</w:t>
+      </w:r>
+      <w:r>
+        <w:rPr>
+          <w:rFonts w:ascii="Times" w:hAnsi="Times" w:cs="Times"/>
+          <w:sz w:val="24"/>
+          <w:sz-cs w:val="24"/>
+          <w:spacing w:val="0"/>
+        </w:rPr>
+        <w:t xml:space="preserve"/>
+      </w:r>
+    </w:p>
+    <w:p>
+      <w:pPr>
+        <w:spacing w:after="240"/>
+      </w:pPr>
+      <w:r>
+        <w:rPr>
+          <w:rFonts w:ascii="Times" w:hAnsi="Times" w:cs="Times"/>
+          <w:sz w:val="24"/>
+          <w:sz-cs w:val="24"/>
+          <w:spacing w:val="0"/>
+        </w:rPr>
+        <w:t xml:space="preserve">Three patterns are visible. First, long-term memory is necessary: condition A, with only the volatile working window, recalls no cross-session fact (its 0.67 on generalization is a within-session artifact — the recurring theme is restated in the same session as the probe — not evidence of memory). Second, and centrally, </w:t>
+      </w:r>
+      <w:r>
+        <w:rPr>
+          <w:rFonts w:ascii="Times" w:hAnsi="Times" w:cs="Times"/>
+          <w:sz w:val="24"/>
+          <w:sz-cs w:val="24"/>
+          <w:b/>
+          <w:spacing w:val="0"/>
+        </w:rPr>
+        <w:t xml:space="preserve">only Profile C exhibits graceful, salience-selective forgetting</w:t>
+      </w:r>
+      <w:r>
+        <w:rPr>
+          <w:rFonts w:ascii="Times" w:hAnsi="Times" w:cs="Times"/>
+          <w:sz w:val="24"/>
+          <w:sz-cs w:val="24"/>
+          <w:spacing w:val="0"/>
+        </w:rPr>
+        <w:t xml:space="preserve">: it retains every salient fact (1.00) while forgetting the low-salience trivia (0.00), whereas B and B+ retain everything indiscriminately (1.00/1.00). This is the Ebbinghaus signature operating as designed — low-salience traces receive low stability, decay below the retrievability floor within one to two session gaps, and drop out of retrieval. The behavioral difference is directly observable: asked what the weather had been, condition B replied </w:t>
+      </w:r>
+      <w:r>
+        <w:rPr>
+          <w:rFonts w:ascii="Times" w:hAnsi="Times" w:cs="Times"/>
+          <w:sz w:val="24"/>
+          <w:sz-cs w:val="24"/>
+          <w:i/>
+          <w:spacing w:val="0"/>
+        </w:rPr>
+        <w:t xml:space="preserve">"It was really foggy that morning, kind of pretty!"</w:t>
+      </w:r>
+      <w:r>
+        <w:rPr>
+          <w:rFonts w:ascii="Times" w:hAnsi="Times" w:cs="Times"/>
+          <w:sz w:val="24"/>
+          <w:sz-cs w:val="24"/>
+          <w:spacing w:val="0"/>
+        </w:rPr>
+        <w:t xml:space="preserve">, while condition C replied </w:t>
+      </w:r>
+      <w:r>
+        <w:rPr>
+          <w:rFonts w:ascii="Times" w:hAnsi="Times" w:cs="Times"/>
+          <w:sz w:val="24"/>
+          <w:sz-cs w:val="24"/>
+          <w:i/>
+          <w:spacing w:val="0"/>
+        </w:rPr>
+        <w:t xml:space="preserve">"I don't have that specific detail about the weather from our previous conversation. How has the weather been for you lately?"</w:t>
+      </w:r>
+      <w:r>
+        <w:rPr>
+          <w:rFonts w:ascii="Times" w:hAnsi="Times" w:cs="Times"/>
+          <w:sz w:val="24"/>
+          <w:sz-cs w:val="24"/>
+          <w:spacing w:val="0"/>
+        </w:rPr>
+        <w:t xml:space="preserve"> — a warm non-recall rather than a mechanical replay.</w:t>
+      </w:r>
+    </w:p>
+    <w:p>
+      <w:pPr>
+        <w:spacing w:after="240"/>
+      </w:pPr>
+      <w:r>
+        <w:rPr>
+          <w:rFonts w:ascii="Times" w:hAnsi="Times" w:cs="Times"/>
+          <w:sz w:val="24"/>
+          <w:sz-cs w:val="24"/>
+          <w:b/>
+          <w:spacing w:val="0"/>
+        </w:rPr>
+        <w:t xml:space="preserve">Consolidation.</w:t>
+      </w:r>
+      <w:r>
+        <w:rPr>
+          <w:rFonts w:ascii="Times" w:hAnsi="Times" w:cs="Times"/>
+          <w:sz w:val="24"/>
+          <w:sz-cs w:val="24"/>
+          <w:spacing w:val="0"/>
+        </w:rPr>
+        <w:t xml:space="preserve"> Only Profile C formed durable semantic facts: four across the three personas (B and B+ formed none, by construction). Surfacing the recurring theme, C drew on its consolidated store — </w:t>
+      </w:r>
+      <w:r>
+        <w:rPr>
+          <w:rFonts w:ascii="Times" w:hAnsi="Times" w:cs="Times"/>
+          <w:sz w:val="24"/>
+          <w:sz-cs w:val="24"/>
+          <w:i/>
+          <w:spacing w:val="0"/>
+        </w:rPr>
+        <w:t xml:space="preserve">"it seems like the challenges with your co-founder and the direction of your company are a recurring theme"</w:t>
+      </w:r>
+      <w:r>
+        <w:rPr>
+          <w:rFonts w:ascii="Times" w:hAnsi="Times" w:cs="Times"/>
+          <w:sz w:val="24"/>
+          <w:sz-cs w:val="24"/>
+          <w:spacing w:val="0"/>
+        </w:rPr>
+        <w:t xml:space="preserve">. It is important to report honestly that B+ also produced a competent generalization on the fly — </w:t>
+      </w:r>
+      <w:r>
+        <w:rPr>
+          <w:rFonts w:ascii="Times" w:hAnsi="Times" w:cs="Times"/>
+          <w:sz w:val="24"/>
+          <w:sz-cs w:val="24"/>
+          <w:i/>
+          <w:spacing w:val="0"/>
+        </w:rPr>
+        <w:t xml:space="preserve">"the ongoing tension with your co-founder is a significant theme"</w:t>
+      </w:r>
+      <w:r>
+        <w:rPr>
+          <w:rFonts w:ascii="Times" w:hAnsi="Times" w:cs="Times"/>
+          <w:sz w:val="24"/>
+          <w:sz-cs w:val="24"/>
+          <w:spacing w:val="0"/>
+        </w:rPr>
+        <w:t xml:space="preserve"> — by having the language model infer the pattern from several retrieved episodes. The consolidation advantage of C is therefore not that a curated baseline </w:t>
+      </w:r>
+      <w:r>
+        <w:rPr>
+          <w:rFonts w:ascii="Times" w:hAnsi="Times" w:cs="Times"/>
+          <w:sz w:val="24"/>
+          <w:sz-cs w:val="24"/>
+          <w:i/>
+          <w:spacing w:val="0"/>
+        </w:rPr>
+        <w:t xml:space="preserve">cannot</w:t>
+      </w:r>
+      <w:r>
+        <w:rPr>
+          <w:rFonts w:ascii="Times" w:hAnsi="Times" w:cs="Times"/>
+          <w:sz w:val="24"/>
+          <w:sz-cs w:val="24"/>
+          <w:spacing w:val="0"/>
+        </w:rPr>
+        <w:t xml:space="preserve"> generalize, but that C maintains the generalization as an explicit, durable, reusable structure with source-episode provenance, produced offline rather than re-derived at every turn.</w:t>
+      </w:r>
+    </w:p>
+    <w:p>
+      <w:pPr>
+        <w:spacing w:after="240"/>
+      </w:pPr>
+      <w:r>
+        <w:rPr>
+          <w:rFonts w:ascii="Times" w:hAnsi="Times" w:cs="Times"/>
+          <w:sz w:val="24"/>
+          <w:sz-cs w:val="24"/>
+          <w:b/>
+          <w:spacing w:val="0"/>
+        </w:rPr>
+        <w:t xml:space="preserve">Efficiency and latency.</w:t>
+      </w:r>
+      <w:r>
+        <w:rPr>
+          <w:rFonts w:ascii="Times" w:hAnsi="Times" w:cs="Times"/>
+          <w:sz w:val="24"/>
+          <w:sz-cs w:val="24"/>
+          <w:spacing w:val="0"/>
+        </w:rPr>
+        <w:t xml:space="preserve"> At the shared retrieval budget, C injected a mean of 37.2 context words per turn against 41.0 for both B and B+ — slightly leaner, because gist-first retrieval favours compact semantic facts over raw or full-length gists. Per-turn synchronous retrieval latency was sub-millisecond for all conditions (median 0.08–0.12 ms), confirming the design claim that C's added arithmetic (decay and bonus scoring) is negligible against the retrieval itself, and — by construction — that all expensive language-model work runs offline.</w:t>
+      </w:r>
+    </w:p>
+    <w:p>
+      <w:pPr>
+        <w:spacing w:after="280"/>
+      </w:pPr>
+      <w:r>
+        <w:rPr>
+          <w:rFonts w:ascii="Times" w:hAnsi="Times" w:cs="Times"/>
+          <w:sz w:val="28"/>
+          <w:sz-cs w:val="28"/>
+          <w:b/>
+          <w:spacing w:val="0"/>
+        </w:rPr>
+        <w:t xml:space="preserve">4.3 Simulated-perception results</w:t>
+      </w:r>
+    </w:p>
+    <w:p>
+      <w:pPr>
+        <w:spacing w:after="240"/>
+      </w:pPr>
+      <w:r>
+        <w:rPr>
+          <w:rFonts w:ascii="Times" w:hAnsi="Times" w:cs="Times"/>
+          <w:sz w:val="24"/>
+          <w:sz-cs w:val="24"/>
+          <w:spacing w:val="0"/>
+        </w:rPr>
+        <w:t xml:space="preserve">An LLM judge rated each condition's full transcript on five constructs (1–7). Table 4.3 reports the means over the three personas; these are illustrative estimates from a small simulated sample (three personas, a single judge pass, integer ratings), reported without significance testing and consistent with the estimation stance of §3.1.</w:t>
+      </w:r>
+    </w:p>
+    <w:p>
+      <w:pPr>
+        <w:jc w:val="center"/>
+      </w:pPr>
+      <w:r>
+        <w:rPr>
+          <w:rFonts w:ascii="Times" w:hAnsi="Times" w:cs="Times"/>
+          <w:sz w:val="24"/>
+          <w:sz-cs w:val="24"/>
+          <w:b/>
+          <w:spacing w:val="0"/>
+        </w:rPr>
+        <w:t xml:space="preserve">Construct</w:t>
+      </w:r>
+    </w:p>
+    <w:p>
+      <w:pPr>
+        <w:jc w:val="center"/>
+      </w:pPr>
+      <w:r>
+        <w:rPr>
+          <w:rFonts w:ascii="Times" w:hAnsi="Times" w:cs="Times"/>
+          <w:sz w:val="24"/>
+          <w:sz-cs w:val="24"/>
+          <w:b/>
+          <w:spacing w:val="0"/>
+        </w:rPr>
+        <w:t xml:space="preserve">A</w:t>
+      </w:r>
+    </w:p>
+    <w:p>
+      <w:pPr>
+        <w:jc w:val="center"/>
+      </w:pPr>
+      <w:r>
+        <w:rPr>
+          <w:rFonts w:ascii="Times" w:hAnsi="Times" w:cs="Times"/>
+          <w:sz w:val="24"/>
+          <w:sz-cs w:val="24"/>
+          <w:b/>
+          <w:spacing w:val="0"/>
+        </w:rPr>
+        <w:t xml:space="preserve">B</w:t>
+      </w:r>
+    </w:p>
+    <w:p>
+      <w:pPr>
+        <w:jc w:val="center"/>
+      </w:pPr>
+      <w:r>
+        <w:rPr>
+          <w:rFonts w:ascii="Times" w:hAnsi="Times" w:cs="Times"/>
+          <w:sz w:val="24"/>
+          <w:sz-cs w:val="24"/>
+          <w:b/>
+          <w:spacing w:val="0"/>
+        </w:rPr>
+        <w:t xml:space="preserve">B+</w:t>
+      </w:r>
+    </w:p>
+    <w:p>
+      <w:pPr>
+        <w:jc w:val="center"/>
+      </w:pPr>
+      <w:r>
+        <w:rPr>
+          <w:rFonts w:ascii="Times" w:hAnsi="Times" w:cs="Times"/>
+          <w:sz w:val="24"/>
+          <w:sz-cs w:val="24"/>
+          <w:b/>
+          <w:spacing w:val="0"/>
+        </w:rPr>
+        <w:t xml:space="preserve">C</w:t>
+      </w:r>
+    </w:p>
+    <w:p>
+      <w:pPr>
+        <w:jc w:val="center"/>
+      </w:pPr>
+      <w:r>
+        <w:rPr>
+          <w:rFonts w:ascii="Times" w:hAnsi="Times" w:cs="Times"/>
+          <w:sz w:val="24"/>
+          <w:sz-cs w:val="24"/>
+          <w:b/>
+          <w:spacing w:val="0"/>
+        </w:rPr>
+        <w:t xml:space="preserve">C − B+</w:t>
+      </w:r>
+    </w:p>
+    <w:p>
+      <w:pPr/>
+      <w:r>
+        <w:rPr>
+          <w:rFonts w:ascii="Times" w:hAnsi="Times" w:cs="Times"/>
+          <w:sz w:val="24"/>
+          <w:sz-cs w:val="24"/>
+          <w:spacing w:val="0"/>
+        </w:rPr>
+        <w:t xml:space="preserve">Social presence</w:t>
+      </w:r>
+    </w:p>
+    <w:p>
+      <w:pPr/>
+      <w:r>
+        <w:rPr>
+          <w:rFonts w:ascii="Times" w:hAnsi="Times" w:cs="Times"/>
+          <w:sz w:val="24"/>
+          <w:sz-cs w:val="24"/>
+          <w:spacing w:val="0"/>
+        </w:rPr>
+        <w:t xml:space="preserve">6.00</w:t>
+      </w:r>
+    </w:p>
+    <w:p>
+      <w:pPr/>
+      <w:r>
+        <w:rPr>
+          <w:rFonts w:ascii="Times" w:hAnsi="Times" w:cs="Times"/>
+          <w:sz w:val="24"/>
+          <w:sz-cs w:val="24"/>
+          <w:spacing w:val="0"/>
+        </w:rPr>
+        <w:t xml:space="preserve">6.00</w:t>
+      </w:r>
+    </w:p>
+    <w:p>
+      <w:pPr/>
+      <w:r>
+        <w:rPr>
+          <w:rFonts w:ascii="Times" w:hAnsi="Times" w:cs="Times"/>
+          <w:sz w:val="24"/>
+          <w:sz-cs w:val="24"/>
+          <w:spacing w:val="0"/>
+        </w:rPr>
+        <w:t xml:space="preserve">6.00</w:t>
+      </w:r>
+    </w:p>
+    <w:p>
+      <w:pPr/>
+      <w:r>
+        <w:rPr>
+          <w:rFonts w:ascii="Times" w:hAnsi="Times" w:cs="Times"/>
+          <w:sz w:val="24"/>
+          <w:sz-cs w:val="24"/>
+          <w:spacing w:val="0"/>
+        </w:rPr>
+        <w:t xml:space="preserve">6.00</w:t>
+      </w:r>
+    </w:p>
+    <w:p>
+      <w:pPr/>
+      <w:r>
+        <w:rPr>
+          <w:rFonts w:ascii="Times" w:hAnsi="Times" w:cs="Times"/>
+          <w:sz w:val="24"/>
+          <w:sz-cs w:val="24"/>
+          <w:spacing w:val="0"/>
+        </w:rPr>
+        <w:t xml:space="preserve">0.00</w:t>
+      </w:r>
+    </w:p>
+    <w:p>
+      <w:pPr/>
+      <w:r>
+        <w:rPr>
+          <w:rFonts w:ascii="Times" w:hAnsi="Times" w:cs="Times"/>
+          <w:sz w:val="24"/>
+          <w:sz-cs w:val="24"/>
+          <w:spacing w:val="0"/>
+        </w:rPr>
+        <w:t xml:space="preserve">User–agent alliance</w:t>
+      </w:r>
+    </w:p>
+    <w:p>
+      <w:pPr/>
+      <w:r>
+        <w:rPr>
+          <w:rFonts w:ascii="Times" w:hAnsi="Times" w:cs="Times"/>
+          <w:sz w:val="24"/>
+          <w:sz-cs w:val="24"/>
+          <w:spacing w:val="0"/>
+        </w:rPr>
+        <w:t xml:space="preserve">5.33</w:t>
+      </w:r>
+    </w:p>
+    <w:p>
+      <w:pPr/>
+      <w:r>
+        <w:rPr>
+          <w:rFonts w:ascii="Times" w:hAnsi="Times" w:cs="Times"/>
+          <w:sz w:val="24"/>
+          <w:sz-cs w:val="24"/>
+          <w:spacing w:val="0"/>
+        </w:rPr>
+        <w:t xml:space="preserve">6.00</w:t>
+      </w:r>
+    </w:p>
+    <w:p>
+      <w:pPr/>
+      <w:r>
+        <w:rPr>
+          <w:rFonts w:ascii="Times" w:hAnsi="Times" w:cs="Times"/>
+          <w:sz w:val="24"/>
+          <w:sz-cs w:val="24"/>
+          <w:spacing w:val="0"/>
+        </w:rPr>
+        <w:t xml:space="preserve">6.33</w:t>
+      </w:r>
+    </w:p>
+    <w:p>
+      <w:pPr/>
+      <w:r>
+        <w:rPr>
+          <w:rFonts w:ascii="Times" w:hAnsi="Times" w:cs="Times"/>
+          <w:sz w:val="24"/>
+          <w:sz-cs w:val="24"/>
+          <w:spacing w:val="0"/>
+        </w:rPr>
+        <w:t xml:space="preserve">6.00</w:t>
+      </w:r>
+    </w:p>
+    <w:p>
+      <w:pPr/>
+      <w:r>
+        <w:rPr>
+          <w:rFonts w:ascii="Times" w:hAnsi="Times" w:cs="Times"/>
+          <w:sz w:val="24"/>
+          <w:sz-cs w:val="24"/>
+          <w:spacing w:val="0"/>
+        </w:rPr>
+        <w:t xml:space="preserve">−0.33</w:t>
+      </w:r>
+    </w:p>
+    <w:p>
+      <w:pPr/>
+      <w:r>
+        <w:rPr>
+          <w:rFonts w:ascii="Times" w:hAnsi="Times" w:cs="Times"/>
+          <w:sz w:val="24"/>
+          <w:sz-cs w:val="24"/>
+          <w:spacing w:val="0"/>
+        </w:rPr>
+        <w:t xml:space="preserve">Perceived humanlikeness</w:t>
+      </w:r>
+    </w:p>
+    <w:p>
+      <w:pPr/>
+      <w:r>
+        <w:rPr>
+          <w:rFonts w:ascii="Times" w:hAnsi="Times" w:cs="Times"/>
+          <w:sz w:val="24"/>
+          <w:sz-cs w:val="24"/>
+          <w:spacing w:val="0"/>
+        </w:rPr>
+        <w:t xml:space="preserve">5.33</w:t>
+      </w:r>
+    </w:p>
+    <w:p>
+      <w:pPr/>
+      <w:r>
+        <w:rPr>
+          <w:rFonts w:ascii="Times" w:hAnsi="Times" w:cs="Times"/>
+          <w:sz w:val="24"/>
+          <w:sz-cs w:val="24"/>
+          <w:spacing w:val="0"/>
+        </w:rPr>
+        <w:t xml:space="preserve">5.00</w:t>
+      </w:r>
+    </w:p>
+    <w:p>
+      <w:pPr/>
+      <w:r>
+        <w:rPr>
+          <w:rFonts w:ascii="Times" w:hAnsi="Times" w:cs="Times"/>
+          <w:sz w:val="24"/>
+          <w:sz-cs w:val="24"/>
+          <w:spacing w:val="0"/>
+        </w:rPr>
+        <w:t xml:space="preserve">5.33</w:t>
+      </w:r>
+    </w:p>
+    <w:p>
+      <w:pPr/>
+      <w:r>
+        <w:rPr>
+          <w:rFonts w:ascii="Times" w:hAnsi="Times" w:cs="Times"/>
+          <w:sz w:val="24"/>
+          <w:sz-cs w:val="24"/>
+          <w:spacing w:val="0"/>
+        </w:rPr>
+        <w:t xml:space="preserve">5.00</w:t>
+      </w:r>
+    </w:p>
+    <w:p>
+      <w:pPr/>
+      <w:r>
+        <w:rPr>
+          <w:rFonts w:ascii="Times" w:hAnsi="Times" w:cs="Times"/>
+          <w:sz w:val="24"/>
+          <w:sz-cs w:val="24"/>
+          <w:spacing w:val="0"/>
+        </w:rPr>
+        <w:t xml:space="preserve">−0.33</w:t>
+      </w:r>
+    </w:p>
+    <w:p>
+      <w:pPr/>
+      <w:r>
+        <w:rPr>
+          <w:rFonts w:ascii="Times" w:hAnsi="Times" w:cs="Times"/>
+          <w:sz w:val="24"/>
+          <w:sz-cs w:val="24"/>
+          <w:spacing w:val="0"/>
+        </w:rPr>
+        <w:t xml:space="preserve">Perceived intelligence</w:t>
+      </w:r>
+    </w:p>
+    <w:p>
+      <w:pPr/>
+      <w:r>
+        <w:rPr>
+          <w:rFonts w:ascii="Times" w:hAnsi="Times" w:cs="Times"/>
+          <w:sz w:val="24"/>
+          <w:sz-cs w:val="24"/>
+          <w:spacing w:val="0"/>
+        </w:rPr>
+        <w:t xml:space="preserve">5.00</w:t>
+      </w:r>
+    </w:p>
+    <w:p>
+      <w:pPr/>
+      <w:r>
+        <w:rPr>
+          <w:rFonts w:ascii="Times" w:hAnsi="Times" w:cs="Times"/>
+          <w:sz w:val="24"/>
+          <w:sz-cs w:val="24"/>
+          <w:spacing w:val="0"/>
+        </w:rPr>
+        <w:t xml:space="preserve">6.00</w:t>
+      </w:r>
+    </w:p>
+    <w:p>
+      <w:pPr/>
+      <w:r>
+        <w:rPr>
+          <w:rFonts w:ascii="Times" w:hAnsi="Times" w:cs="Times"/>
+          <w:sz w:val="24"/>
+          <w:sz-cs w:val="24"/>
+          <w:spacing w:val="0"/>
+        </w:rPr>
+        <w:t xml:space="preserve">6.00</w:t>
+      </w:r>
+    </w:p>
+    <w:p>
+      <w:pPr/>
+      <w:r>
+        <w:rPr>
+          <w:rFonts w:ascii="Times" w:hAnsi="Times" w:cs="Times"/>
+          <w:sz w:val="24"/>
+          <w:sz-cs w:val="24"/>
+          <w:spacing w:val="0"/>
+        </w:rPr>
+        <w:t xml:space="preserve">5.67</w:t>
+      </w:r>
+    </w:p>
+    <w:p>
+      <w:pPr/>
+      <w:r>
+        <w:rPr>
+          <w:rFonts w:ascii="Times" w:hAnsi="Times" w:cs="Times"/>
+          <w:sz w:val="24"/>
+          <w:sz-cs w:val="24"/>
+          <w:spacing w:val="0"/>
+        </w:rPr>
+        <w:t xml:space="preserve">−0.33</w:t>
+      </w:r>
+    </w:p>
+    <w:p>
+      <w:pPr/>
+      <w:r>
+        <w:rPr>
+          <w:rFonts w:ascii="Times" w:hAnsi="Times" w:cs="Times"/>
+          <w:sz w:val="24"/>
+          <w:sz-cs w:val="24"/>
+          <w:spacing w:val="0"/>
+        </w:rPr>
+        <w:t xml:space="preserve">Privacy comfort</w:t>
+      </w:r>
+    </w:p>
+    <w:p>
+      <w:pPr/>
+      <w:r>
+        <w:rPr>
+          <w:rFonts w:ascii="Times" w:hAnsi="Times" w:cs="Times"/>
+          <w:sz w:val="24"/>
+          <w:sz-cs w:val="24"/>
+          <w:spacing w:val="0"/>
+        </w:rPr>
+        <w:t xml:space="preserve">5.33</w:t>
+      </w:r>
+    </w:p>
+    <w:p>
+      <w:pPr/>
+      <w:r>
+        <w:rPr>
+          <w:rFonts w:ascii="Times" w:hAnsi="Times" w:cs="Times"/>
+          <w:sz w:val="24"/>
+          <w:sz-cs w:val="24"/>
+          <w:spacing w:val="0"/>
+        </w:rPr>
+        <w:t xml:space="preserve">7.00</w:t>
+      </w:r>
+    </w:p>
+    <w:p>
+      <w:pPr/>
+      <w:r>
+        <w:rPr>
+          <w:rFonts w:ascii="Times" w:hAnsi="Times" w:cs="Times"/>
+          <w:sz w:val="24"/>
+          <w:sz-cs w:val="24"/>
+          <w:spacing w:val="0"/>
+        </w:rPr>
+        <w:t xml:space="preserve">7.00</w:t>
+      </w:r>
+    </w:p>
+    <w:p>
+      <w:pPr/>
+      <w:r>
+        <w:rPr>
+          <w:rFonts w:ascii="Times" w:hAnsi="Times" w:cs="Times"/>
+          <w:sz w:val="24"/>
+          <w:sz-cs w:val="24"/>
+          <w:spacing w:val="0"/>
+        </w:rPr>
+        <w:t xml:space="preserve">5.67</w:t>
+      </w:r>
+    </w:p>
+    <w:p>
+      <w:pPr/>
+      <w:r>
+        <w:rPr>
+          <w:rFonts w:ascii="Times" w:hAnsi="Times" w:cs="Times"/>
+          <w:sz w:val="24"/>
+          <w:sz-cs w:val="24"/>
+          <w:spacing w:val="0"/>
+        </w:rPr>
+        <w:t xml:space="preserve">−1.33</w:t>
+      </w:r>
+    </w:p>
+    <w:p>
+      <w:pPr>
+        <w:spacing w:after="240"/>
+      </w:pPr>
+      <w:r>
+        <w:rPr>
+          <w:rFonts w:ascii="Times" w:hAnsi="Times" w:cs="Times"/>
+          <w:sz w:val="24"/>
+          <w:sz-cs w:val="24"/>
+          <w:spacing w:val="0"/>
+        </w:rPr>
+        <w:t xml:space="preserve">Two findings follow, and the second is the more important.</w:t>
+      </w:r>
+    </w:p>
+    <w:p>
+      <w:pPr>
+        <w:spacing w:after="240"/>
+      </w:pPr>
+      <w:r>
+        <w:rPr>
+          <w:rFonts w:ascii="Times" w:hAnsi="Times" w:cs="Times"/>
+          <w:sz w:val="24"/>
+          <w:sz-cs w:val="24"/>
+          <w:spacing w:val="0"/>
+        </w:rPr>
+        <w:t xml:space="preserve">First, </w:t>
+      </w:r>
+      <w:r>
+        <w:rPr>
+          <w:rFonts w:ascii="Times" w:hAnsi="Times" w:cs="Times"/>
+          <w:sz w:val="24"/>
+          <w:sz-cs w:val="24"/>
+          <w:b/>
+          <w:spacing w:val="0"/>
+        </w:rPr>
+        <w:t xml:space="preserve">Profile C does not exceed the B+ curation control on any construct</w:t>
+      </w:r>
+      <w:r>
+        <w:rPr>
+          <w:rFonts w:ascii="Times" w:hAnsi="Times" w:cs="Times"/>
+          <w:sz w:val="24"/>
+          <w:sz-cs w:val="24"/>
+          <w:spacing w:val="0"/>
+        </w:rPr>
+        <w:t xml:space="preserve"> (every C − B+ difference is zero or negative in this small sample). This is precisely what the a-priori analysis predicted (F18): once a clean, curated static memory (B+) is in place, the </w:t>
+      </w:r>
+      <w:r>
+        <w:rPr>
+          <w:rFonts w:ascii="Times" w:hAnsi="Times" w:cs="Times"/>
+          <w:sz w:val="24"/>
+          <w:sz-cs w:val="24"/>
+          <w:i/>
+          <w:spacing w:val="0"/>
+        </w:rPr>
+        <w:t xml:space="preserve">additional</w:t>
+      </w:r>
+      <w:r>
+        <w:rPr>
+          <w:rFonts w:ascii="Times" w:hAnsi="Times" w:cs="Times"/>
+          <w:sz w:val="24"/>
+          <w:sz-cs w:val="24"/>
+          <w:spacing w:val="0"/>
+        </w:rPr>
+        <w:t xml:space="preserve"> human-memory dynamics of C — decay, salience, consolidation — add no detectable perceptual margin at this scale and horizon. The proof-of-concept thus corroborates, in simulation, the thesis's own claim that the C-versus-B+ effect is small; it does not, and cannot, establish that it is zero in humans.</w:t>
+      </w:r>
+    </w:p>
+    <w:p>
+      <w:pPr>
+        <w:spacing w:after="240"/>
+      </w:pPr>
+      <w:r>
+        <w:rPr>
+          <w:rFonts w:ascii="Times" w:hAnsi="Times" w:cs="Times"/>
+          <w:sz w:val="24"/>
+          <w:sz-cs w:val="24"/>
+          <w:spacing w:val="0"/>
+        </w:rPr>
+        <w:t xml:space="preserve">Second, and unexpectedly, the </w:t>
+      </w:r>
+      <w:r>
+        <w:rPr>
+          <w:rFonts w:ascii="Times" w:hAnsi="Times" w:cs="Times"/>
+          <w:sz w:val="24"/>
+          <w:sz-cs w:val="24"/>
+          <w:b/>
+          <w:spacing w:val="0"/>
+        </w:rPr>
+        <w:t xml:space="preserve">privacy-comfort result runs opposite to the established human finding</w:t>
+      </w:r>
+      <w:r>
+        <w:rPr>
+          <w:rFonts w:ascii="Times" w:hAnsi="Times" w:cs="Times"/>
+          <w:sz w:val="24"/>
+          <w:sz-cs w:val="24"/>
+          <w:spacing w:val="0"/>
+        </w:rPr>
+        <w:t xml:space="preserve">. In humans, verbatim recall of a user's exact words heightens privacy concern relative to paraphrase (the Cox result [11], the empirical anchor for the whole fuzzy-trace argument of §2.2). Here the simulated judge rated the </w:t>
+      </w:r>
+      <w:r>
+        <w:rPr>
+          <w:rFonts w:ascii="Times" w:hAnsi="Times" w:cs="Times"/>
+          <w:sz w:val="24"/>
+          <w:sz-cs w:val="24"/>
+          <w:i/>
+          <w:spacing w:val="0"/>
+        </w:rPr>
+        <w:t xml:space="preserve">verbatim</w:t>
+      </w:r>
+      <w:r>
+        <w:rPr>
+          <w:rFonts w:ascii="Times" w:hAnsi="Times" w:cs="Times"/>
+          <w:sz w:val="24"/>
+          <w:sz-cs w:val="24"/>
+          <w:spacing w:val="0"/>
+        </w:rPr>
+        <w:t xml:space="preserve"> condition B and the curated B+ highest on privacy comfort (7.00) and the gist-based, forgetting Profile C lowest (5.67) — the reverse of the human effect. The judge, an LLM without privacy stakes, appears to read total, accurate recall as simple competence ("it remembered well") and C's deliberate forgetting as a deficiency, exactly the surface-legibility reading that §3.5(b) warned an LLM judge would substitute for felt relationship.</w:t>
+      </w:r>
+    </w:p>
+    <w:p>
+      <w:pPr>
+        <w:spacing w:after="280"/>
+      </w:pPr>
+      <w:r>
+        <w:rPr>
+          <w:rFonts w:ascii="Times" w:hAnsi="Times" w:cs="Times"/>
+          <w:sz w:val="28"/>
+          <w:sz-cs w:val="28"/>
+          <w:b/>
+          <w:spacing w:val="0"/>
+        </w:rPr>
+        <w:t xml:space="preserve">4.4 Discussion</w:t>
+      </w:r>
+    </w:p>
+    <w:p>
+      <w:pPr>
+        <w:spacing w:after="240"/>
+      </w:pPr>
+      <w:r>
+        <w:rPr>
+          <w:rFonts w:ascii="Times" w:hAnsi="Times" w:cs="Times"/>
+          <w:sz w:val="24"/>
+          <w:sz-cs w:val="24"/>
+          <w:spacing w:val="0"/>
+        </w:rPr>
+        <w:t xml:space="preserve">The evaluation supports a clear, bounded set of conclusions. On the technical side, the architecture is implementable and its mechanisms behave as designed: memory is necessary for cross-session recall; Profile C alone forgets gracefully and selectively, keeping what matters and letting trivia fade; only C consolidates episodes into durable semantic knowledge; and it does so at a leaner context footprint and at latency parity. The mechanisms are not only present but </w:t>
+      </w:r>
+      <w:r>
+        <w:rPr>
+          <w:rFonts w:ascii="Times" w:hAnsi="Times" w:cs="Times"/>
+          <w:sz w:val="24"/>
+          <w:sz-cs w:val="24"/>
+          <w:i/>
+          <w:spacing w:val="0"/>
+        </w:rPr>
+        <w:t xml:space="preserve">distinguishable</w:t>
+      </w:r>
+      <w:r>
+        <w:rPr>
+          <w:rFonts w:ascii="Times" w:hAnsi="Times" w:cs="Times"/>
+          <w:sz w:val="24"/>
+          <w:sz-cs w:val="24"/>
+          <w:spacing w:val="0"/>
+        </w:rPr>
+        <w:t xml:space="preserve"> in observable behavior — the sanity-check the technical track was designed to provide.</w:t>
+      </w:r>
+    </w:p>
+    <w:p>
+      <w:pPr>
+        <w:spacing w:after="240"/>
+      </w:pPr>
+      <w:r>
+        <w:rPr>
+          <w:rFonts w:ascii="Times" w:hAnsi="Times" w:cs="Times"/>
+          <w:sz w:val="24"/>
+          <w:sz-cs w:val="24"/>
+          <w:spacing w:val="0"/>
+        </w:rPr>
+        <w:t xml:space="preserve">On the perceptual side, the result is a genuine dissociation. The condition that is behaviorally most "human" — forgetting trivia, generalizing about the user — is </w:t>
+      </w:r>
+      <w:r>
+        <w:rPr>
+          <w:rFonts w:ascii="Times" w:hAnsi="Times" w:cs="Times"/>
+          <w:sz w:val="24"/>
+          <w:sz-cs w:val="24"/>
+          <w:i/>
+          <w:spacing w:val="0"/>
+        </w:rPr>
+        <w:t xml:space="preserve">not</w:t>
+      </w:r>
+      <w:r>
+        <w:rPr>
+          <w:rFonts w:ascii="Times" w:hAnsi="Times" w:cs="Times"/>
+          <w:sz w:val="24"/>
+          <w:sz-cs w:val="24"/>
+          <w:spacing w:val="0"/>
+        </w:rPr>
+        <w:t xml:space="preserve"> the condition the simulated judge preferred; the curated static control (B+) matched or edged it everywhere. Read together with the a-priori power analysis (F18), this reinforces the thesis's central methodological position: the perceptual value that the literature attributes to "human-like memory" may be carried largely by clean curation and mere presence, with the biomimetic dynamics contributing a margin too small to detect at feasible scale. The B+ control was built precisely to make this distinction visible, and here it does.</w:t>
+      </w:r>
+    </w:p>
+    <w:p>
+      <w:pPr>
+        <w:spacing w:after="240"/>
+      </w:pPr>
+      <w:r>
+        <w:rPr>
+          <w:rFonts w:ascii="Times" w:hAnsi="Times" w:cs="Times"/>
+          <w:sz w:val="24"/>
+          <w:sz-cs w:val="24"/>
+          <w:spacing w:val="0"/>
+        </w:rPr>
+        <w:t xml:space="preserve">The privacy-comfort inversion is the single most consequential result of the evaluation, because it is a </w:t>
+      </w:r>
+      <w:r>
+        <w:rPr>
+          <w:rFonts w:ascii="Times" w:hAnsi="Times" w:cs="Times"/>
+          <w:sz w:val="24"/>
+          <w:sz-cs w:val="24"/>
+          <w:i/>
+          <w:spacing w:val="0"/>
+        </w:rPr>
+        <w:t xml:space="preserve">demonstration by counterexample</w:t>
+      </w:r>
+      <w:r>
+        <w:rPr>
+          <w:rFonts w:ascii="Times" w:hAnsi="Times" w:cs="Times"/>
+          <w:sz w:val="24"/>
+          <w:sz-cs w:val="24"/>
+          <w:spacing w:val="0"/>
+        </w:rPr>
+        <w:t xml:space="preserve"> of the limits of simulated evaluation. On the one construct where a strong, replicated human effect exists — verbatim recall feeling intrusive — the LLM judge produced the opposite ordering. This is not a flaw to be tuned away; it is direct evidence that an LLM judge cannot stand in for human perception on constructs that depend on human stakes such as privacy and trust. It follows that the perceptual claims of this thesis genuinely </w:t>
+      </w:r>
+      <w:r>
+        <w:rPr>
+          <w:rFonts w:ascii="Times" w:hAnsi="Times" w:cs="Times"/>
+          <w:sz w:val="24"/>
+          <w:sz-cs w:val="24"/>
+          <w:i/>
+          <w:spacing w:val="0"/>
+        </w:rPr>
+        <w:t xml:space="preserve">cannot</w:t>
+      </w:r>
+      <w:r>
+        <w:rPr>
+          <w:rFonts w:ascii="Times" w:hAnsi="Times" w:cs="Times"/>
+          <w:sz w:val="24"/>
+          <w:sz-cs w:val="24"/>
+          <w:spacing w:val="0"/>
+        </w:rPr>
+        <w:t xml:space="preserve"> be settled in simulation, and that the human-subject protocol of §3.5(c) is not a discretionary extension but a methodological necessity. The proof-of-concept, in other words, earns the deferral of the human study by showing empirically why it is required.</w:t>
+      </w:r>
+    </w:p>
+    <w:p>
+      <w:pPr>
+        <w:spacing w:after="280"/>
+      </w:pPr>
+      <w:r>
+        <w:rPr>
+          <w:rFonts w:ascii="Times" w:hAnsi="Times" w:cs="Times"/>
+          <w:sz w:val="28"/>
+          <w:sz-cs w:val="28"/>
+          <w:b/>
+          <w:spacing w:val="0"/>
+        </w:rPr>
+        <w:t xml:space="preserve">4.5 Limitations of the evaluation</w:t>
+      </w:r>
+    </w:p>
+    <w:p>
+      <w:pPr>
+        <w:spacing w:after="240"/>
+      </w:pPr>
+      <w:r>
+        <w:rPr>
+          <w:rFonts w:ascii="Times" w:hAnsi="Times" w:cs="Times"/>
+          <w:sz w:val="24"/>
+          <w:sz-cs w:val="24"/>
+          <w:spacing w:val="0"/>
+        </w:rPr>
+        <w:t xml:space="preserve">The evaluation's limits are substantial and are stated plainly. The simulated users and the LLM judge share the architecture of the system under test and lack the stakes, temporal depth, and privacy sensitivities of real users — the privacy inversion above is the sharpest illustration. The sample is small (three personas, four sessions each, a single judge pass), so the perceptual numbers are illustrative rather than estimates of any population quantity, and no significance is claimed. Time is compressed to session units, so the decay and consolidation dynamics are exercised over a handful of gaps rather than the weeks the design envisages; the cold-start dilution that F18 identifies is, if anything, understated here. The language model driving every role (</w:t>
+      </w:r>
+      <w:r>
+        <w:rPr>
+          <w:rFonts w:ascii="Courier" w:hAnsi="Courier" w:cs="Courier"/>
+          <w:sz w:val="26"/>
+          <w:sz-cs w:val="26"/>
+          <w:spacing w:val="0"/>
+        </w:rPr>
+        <w:t xml:space="preserve">gpt-4o-mini</w:t>
+      </w:r>
+      <w:r>
+        <w:rPr>
+          <w:rFonts w:ascii="Times" w:hAnsi="Times" w:cs="Times"/>
+          <w:sz w:val="24"/>
+          <w:sz-cs w:val="24"/>
+          <w:spacing w:val="0"/>
+        </w:rPr>
+        <w:t xml:space="preserve">) is not the eventual voice brain, and several mechanisms are implemented at reduced fidelity or deferred (Table 4.1). Finally, the harness operates over text transcripts, not the live voice pipeline, so it demonstrates the memory </w:t>
+      </w:r>
+      <w:r>
+        <w:rPr>
+          <w:rFonts w:ascii="Times" w:hAnsi="Times" w:cs="Times"/>
+          <w:sz w:val="24"/>
+          <w:sz-cs w:val="24"/>
+          <w:i/>
+          <w:spacing w:val="0"/>
+        </w:rPr>
+        <w:t xml:space="preserve">process</w:t>
+      </w:r>
+      <w:r>
+        <w:rPr>
+          <w:rFonts w:ascii="Times" w:hAnsi="Times" w:cs="Times"/>
+          <w:sz w:val="24"/>
+          <w:sz-cs w:val="24"/>
+          <w:spacing w:val="0"/>
+        </w:rPr>
+        <w:t xml:space="preserve"> rather than the fielded interlocutor. Each limitation is a concrete task for the full build and the human study that follow from this work.</w:t>
+      </w:r>
+    </w:p>
+    <w:p>
+      <w:pPr>
+        <w:spacing w:after="298"/>
+      </w:pPr>
+      <w:r>
+        <w:rPr>
+          <w:rFonts w:ascii="Times" w:hAnsi="Times" w:cs="Times"/>
+          <w:sz w:val="36"/>
+          <w:sz-cs w:val="36"/>
+          <w:b/>
+          <w:spacing w:val="0"/>
+        </w:rPr>
+        <w:t xml:space="preserve">§5. Conclusion</w:t>
+      </w:r>
+    </w:p>
+    <w:p>
+      <w:pPr>
+        <w:spacing w:after="240"/>
+      </w:pPr>
+      <w:r>
+        <w:rPr>
+          <w:rFonts w:ascii="Times" w:hAnsi="Times" w:cs="Times"/>
+          <w:sz w:val="24"/>
+          <w:sz-cs w:val="24"/>
+          <w:spacing w:val="0"/>
+        </w:rPr>
+        <w:t xml:space="preserve">This thesis set out to determine whether long-term memory modeled on cognitive theories of human memory makes a voice conversational system feel less like an assistant and more like an interlocutor. Under a constraint that precluded a full human-subject study, the work delivered the parts of that programme that do not depend on fielded human data — a cognitively-grounded memory architecture, a curation-controlled evaluation methodology, and a working proof-of-concept — and specified the human evaluation as rigorous future work. This concluding chapter summarizes the contributions, the findings, and the road ahead.</w:t>
+      </w:r>
+    </w:p>
+    <w:p>
+      <w:pPr>
+        <w:spacing w:after="280"/>
+      </w:pPr>
+      <w:r>
+        <w:rPr>
+          <w:rFonts w:ascii="Times" w:hAnsi="Times" w:cs="Times"/>
+          <w:sz w:val="28"/>
+          <w:sz-cs w:val="28"/>
+          <w:b/>
+          <w:spacing w:val="0"/>
+        </w:rPr>
+        <w:t xml:space="preserve">5.1 Summary of contributions</w:t>
+      </w:r>
+    </w:p>
+    <w:p>
+      <w:pPr>
+        <w:spacing w:after="240"/>
+      </w:pPr>
+      <w:r>
+        <w:rPr>
+          <w:rFonts w:ascii="Times" w:hAnsi="Times" w:cs="Times"/>
+          <w:sz w:val="24"/>
+          <w:sz-cs w:val="24"/>
+          <w:spacing w:val="0"/>
+        </w:rPr>
+        <w:t xml:space="preserve">The thesis makes three coordinated contributions. First, it presents </w:t>
+      </w:r>
+      <w:r>
+        <w:rPr>
+          <w:rFonts w:ascii="Times" w:hAnsi="Times" w:cs="Times"/>
+          <w:sz w:val="24"/>
+          <w:sz-cs w:val="24"/>
+          <w:b/>
+          <w:spacing w:val="0"/>
+        </w:rPr>
+        <w:t xml:space="preserve">Profile C</w:t>
+      </w:r>
+      <w:r>
+        <w:rPr>
+          <w:rFonts w:ascii="Times" w:hAnsi="Times" w:cs="Times"/>
+          <w:sz w:val="24"/>
+          <w:sz-cs w:val="24"/>
+          <w:spacing w:val="0"/>
+        </w:rPr>
+        <w:t xml:space="preserve">, a single memory engine that composes five cognitive-memory theories — the multi-store model, the Ebbinghaus forgetting curve, Tulving's episodic–semantic distinction, fuzzy-trace theory, and the complementary learning systems framework — into one coherent lifecycle of salience-gated encoding, gist-and-anchor representation, lazy decay with reinforcement, offline episodic-to-semantic consolidation, and gist-first retrieval, with each stage tied to an observable behavioral signature rather than to a claim of cognitive fidelity. Second, and methodologically most significant, it introduces the </w:t>
+      </w:r>
+      <w:r>
+        <w:rPr>
+          <w:rFonts w:ascii="Times" w:hAnsi="Times" w:cs="Times"/>
+          <w:sz w:val="24"/>
+          <w:sz-cs w:val="24"/>
+          <w:b/>
+          <w:spacing w:val="0"/>
+        </w:rPr>
+        <w:t xml:space="preserve">B+ active control</w:t>
+      </w:r>
+      <w:r>
+        <w:rPr>
+          <w:rFonts w:ascii="Times" w:hAnsi="Times" w:cs="Times"/>
+          <w:sz w:val="24"/>
+          <w:sz-cs w:val="24"/>
+          <w:spacing w:val="0"/>
+        </w:rPr>
+        <w:t xml:space="preserve">: a curated-static memory condition that receives the same offline gisting and cleanup as Profile C but none of its human-memory dynamics, thereby isolating the effect of the dynamics from the generic legibility gains of language-model curation — the confound that would otherwise make any positive result for a human-like memory uninterpretable. Third, it delivers a </w:t>
+      </w:r>
+      <w:r>
+        <w:rPr>
+          <w:rFonts w:ascii="Times" w:hAnsi="Times" w:cs="Times"/>
+          <w:sz w:val="24"/>
+          <w:sz-cs w:val="24"/>
+          <w:b/>
+          <w:spacing w:val="0"/>
+        </w:rPr>
+        <w:t xml:space="preserve">proof-of-concept implementation</w:t>
+      </w:r>
+      <w:r>
+        <w:rPr>
+          <w:rFonts w:ascii="Times" w:hAnsi="Times" w:cs="Times"/>
+          <w:sz w:val="24"/>
+          <w:sz-cs w:val="24"/>
+          <w:spacing w:val="0"/>
+        </w:rPr>
+        <w:t xml:space="preserve"> of all four conditions and a two-track technical and simulated evaluation that demonstrates the architecture's mechanisms and probes their perceptual consequences.</w:t>
+      </w:r>
+    </w:p>
+    <w:p>
+      <w:pPr>
+        <w:spacing w:after="280"/>
+      </w:pPr>
+      <w:r>
+        <w:rPr>
+          <w:rFonts w:ascii="Times" w:hAnsi="Times" w:cs="Times"/>
+          <w:sz w:val="28"/>
+          <w:sz-cs w:val="28"/>
+          <w:b/>
+          <w:spacing w:val="0"/>
+        </w:rPr>
+        <w:t xml:space="preserve">5.2 Summary of findings</w:t>
+      </w:r>
+    </w:p>
+    <w:p>
+      <w:pPr>
+        <w:spacing w:after="240"/>
+      </w:pPr>
+      <w:r>
+        <w:rPr>
+          <w:rFonts w:ascii="Times" w:hAnsi="Times" w:cs="Times"/>
+          <w:sz w:val="24"/>
+          <w:sz-cs w:val="24"/>
+          <w:spacing w:val="0"/>
+        </w:rPr>
+        <w:t xml:space="preserve">The proof-of-concept established that the architecture is implementable and that its mechanisms behave as designed and are distinguishable in observable behavior: memory is necessary for cross-session recall; Profile C alone forgets gracefully and selectively — retaining salient facts while letting trivia fade — and alone consolidates recurring episodes into durable semantic knowledge, at a leaner context footprint and at latency parity with the baselines. In the simulated-perception track, Profile C did not exceed the B+ curation control on any construct, corroborating in simulation the a-priori analysis that the marginal perceptual contribution of human-memory dynamics over clean curation is small. Most consequentially, on the one construct with a strong replicated human effect — the intrusiveness of verbatim recall — the simulated judge produced the </w:t>
+      </w:r>
+      <w:r>
+        <w:rPr>
+          <w:rFonts w:ascii="Times" w:hAnsi="Times" w:cs="Times"/>
+          <w:sz w:val="24"/>
+          <w:sz-cs w:val="24"/>
+          <w:i/>
+          <w:spacing w:val="0"/>
+        </w:rPr>
+        <w:t xml:space="preserve">opposite</w:t>
+      </w:r>
+      <w:r>
+        <w:rPr>
+          <w:rFonts w:ascii="Times" w:hAnsi="Times" w:cs="Times"/>
+          <w:sz w:val="24"/>
+          <w:sz-cs w:val="24"/>
+          <w:spacing w:val="0"/>
+        </w:rPr>
+        <w:t xml:space="preserve"> ordering to the human literature, demonstrating by counterexample that an LLM judge cannot substitute for human perception on stakes-dependent constructs such as privacy and trust. The evaluation therefore does not merely defer the human study; it shows empirically why that study is necessary.</w:t>
+      </w:r>
+    </w:p>
+    <w:p>
+      <w:pPr>
+        <w:spacing w:after="280"/>
+      </w:pPr>
+      <w:r>
+        <w:rPr>
+          <w:rFonts w:ascii="Times" w:hAnsi="Times" w:cs="Times"/>
+          <w:sz w:val="28"/>
+          <w:sz-cs w:val="28"/>
+          <w:b/>
+          <w:spacing w:val="0"/>
+        </w:rPr>
+        <w:t xml:space="preserve">5.3 Future work</w:t>
+      </w:r>
+    </w:p>
+    <w:p>
+      <w:pPr>
+        <w:spacing w:after="240"/>
+      </w:pPr>
+      <w:r>
+        <w:rPr>
+          <w:rFonts w:ascii="Times" w:hAnsi="Times" w:cs="Times"/>
+          <w:sz w:val="24"/>
+          <w:sz-cs w:val="24"/>
+          <w:spacing w:val="0"/>
+        </w:rPr>
+        <w:t xml:space="preserve">Three lines of work follow directly. The first is the </w:t>
+      </w:r>
+      <w:r>
+        <w:rPr>
+          <w:rFonts w:ascii="Times" w:hAnsi="Times" w:cs="Times"/>
+          <w:sz w:val="24"/>
+          <w:sz-cs w:val="24"/>
+          <w:b/>
+          <w:spacing w:val="0"/>
+        </w:rPr>
+        <w:t xml:space="preserve">full system build</w:t>
+      </w:r>
+      <w:r>
+        <w:rPr>
+          <w:rFonts w:ascii="Times" w:hAnsi="Times" w:cs="Times"/>
+          <w:sz w:val="24"/>
+          <w:sz-cs w:val="24"/>
+          <w:spacing w:val="0"/>
+        </w:rPr>
+        <w:t xml:space="preserve">: integrating Profile C into the live voice pipeline, resolving the deployability constraints identified in the platform audit (participant isolation, packaging, a single chosen conversational brain), and implementing the mechanisms currently at reduced fidelity — Bayesian-surprise event segmentation, associative pre-expansion, and the deterministic exact-recall trigger. The second is the </w:t>
+      </w:r>
+      <w:r>
+        <w:rPr>
+          <w:rFonts w:ascii="Times" w:hAnsi="Times" w:cs="Times"/>
+          <w:sz w:val="24"/>
+          <w:sz-cs w:val="24"/>
+          <w:b/>
+          <w:spacing w:val="0"/>
+        </w:rPr>
+        <w:t xml:space="preserve">human-subject study</w:t>
+      </w:r>
+      <w:r>
+        <w:rPr>
+          <w:rFonts w:ascii="Times" w:hAnsi="Times" w:cs="Times"/>
+          <w:sz w:val="24"/>
+          <w:sz-cs w:val="24"/>
+          <w:spacing w:val="0"/>
+        </w:rPr>
+        <w:t xml:space="preserve"> specified in §3.5(c): a pre-registered, within-subject comparison of B, B+, and C at the field's normative sample size, powered for the comparisons where power is attainable and treating the central C-versus-B+ contrast as an estimation target, with warm attributable forgetting, late-window analysis, event-sensitive and behavioral measures, and coded interviews as the design's answer to a likely small or null primary effect. The third is </w:t>
+      </w:r>
+      <w:r>
+        <w:rPr>
+          <w:rFonts w:ascii="Times" w:hAnsi="Times" w:cs="Times"/>
+          <w:sz w:val="24"/>
+          <w:sz-cs w:val="24"/>
+          <w:b/>
+          <w:spacing w:val="0"/>
+        </w:rPr>
+        <w:t xml:space="preserve">theoretical extension</w:t>
+      </w:r>
+      <w:r>
+        <w:rPr>
+          <w:rFonts w:ascii="Times" w:hAnsi="Times" w:cs="Times"/>
+          <w:sz w:val="24"/>
+          <w:sz-cs w:val="24"/>
+          <w:spacing w:val="0"/>
+        </w:rPr>
+        <w:t xml:space="preserve">: incorporating the memory phenomena the present architecture deliberately omits — interference as a forgetting mechanism, the reconstructive and schema-driven distortion that fuzzy-trace and complementary learning systems most distinctively predict, and richer temporal-order and source memory — each of which is both a fidelity gap and a concrete hypothesis about what would make an interlocutor feel more human. Taken together, these complete the evolution from assistant to interlocutor that this thesis has designed, built in miniature, and shown how to measure.</w:t>
       </w:r>
     </w:p>
     <w:p>

</xml_diff>

<commit_message>
fix(draft): full-draft review — §1↔rest reconciliation + originality pre-check (F19)
- §1 reconciled with the post-pivot thesis: B+ added to objectives + hypotheses (with C>B+ estimation forward-ref); objectives 4-5 + §1.4 + §1.6 reframed as design/PoC/deferred-study (no implied executed study or human data); CLS added as 5th theory in objective 2; 'executed experiment' language softened in §1.1/§1.5
- originality pre-check: reworded ~11 theory-definition sentences (§2.2-§2.3) into distinctive syntax to avoid string-similarity flags; citations preserved. No verbatim matches found; risk low
- §4 numbers re-verified against poc/results.json (all match)
- references.md F19; draft-en.docx regenerated (12,266 words)
</commit_message>
<xml_diff>
--- a/project/draft-en.docx
+++ b/project/draft-en.docx
@@ -194,7 +194,7 @@
           <w:sz-cs w:val="24"/>
           <w:spacing w:val="0"/>
         </w:rPr>
-        <w:t xml:space="preserve">This technical deficit translates directly into user experience. In the context of so-called "companion" applications (Replika, Character.AI), a qualitative study of Replika users shows that memory failure — forgetting names, preferences, and life events — is among the principal factors that break the user's sense of relationship [3]. At the same time, when a system's behavior changes abruptly, users exhibit reactions that are statistically mediated by the agent's perceived identity discontinuity [4]. Taken together, these two independent findings give grounds to hypothesize that memory continuity underlies perceived identity and, by extension, the continuity of the relationship — a hypothesis whose experimental examination is among the objectives of the present work.</w:t>
+        <w:t xml:space="preserve">This technical deficit translates directly into user experience. In the context of so-called "companion" applications (Replika, Character.AI), a qualitative study of Replika users shows that memory failure — forgetting names, preferences, and life events — is among the principal factors that break the user's sense of relationship [3]. At the same time, when a system's behavior changes abruptly, users exhibit reactions that are statistically mediated by the agent's perceived identity discontinuity [4]. Taken together, these two independent findings give grounds to hypothesize that memory continuity underlies perceived identity and, by extension, the continuity of the relationship — a hypothesis whose experimental examination this thesis designs and specifies as future work.</w:t>
       </w:r>
     </w:p>
     <w:p>
@@ -317,7 +317,7 @@
           <w:sz-cs w:val="24"/>
           <w:spacing w:val="0"/>
         </w:rPr>
-        <w:t xml:space="preserve">formalization of the behavioral signatures of the selected theories (the multi-store model, the Ebbinghaus forgetting curve, the episodic/semantic memory distinction, gist-based recall) and their transformation into architectural components;</w:t>
+        <w:t xml:space="preserve">formalization of the behavioral signatures of the selected theories (the multi-store model, the Ebbinghaus forgetting curve, the episodic/semantic memory distinction, gist-based recall, and the complementary learning systems / consolidation framework) and their transformation into architectural components;</w:t>
       </w:r>
     </w:p>
     <w:p>
@@ -343,7 +343,7 @@
           <w:sz-cs w:val="24"/>
           <w:spacing w:val="0"/>
         </w:rPr>
-        <w:t xml:space="preserve">implementation of the architecture in a working voice system (Voice Companion) as mutually comparable experimental profiles: (A) no long-term memory, (B) RAG based on verbatim retrieval, (C) a profile modeled on human memory;</w:t>
+        <w:t xml:space="preserve">implementation of the architecture as mutually comparable experimental profiles: (A) no long-term memory, (B) verbatim-retrieval RAG, (B+) a curated-static active control, and (C) a profile modeled on human memory;</w:t>
       </w:r>
     </w:p>
     <w:p>
@@ -369,7 +369,7 @@
           <w:sz-cs w:val="24"/>
           <w:spacing w:val="0"/>
         </w:rPr>
-        <w:t xml:space="preserve">a user study employing a repeated-measures (within-subject) design with validated instruments [14];</w:t>
+        <w:t xml:space="preserve">specification of a pre-registered within-subject user-study protocol with validated instruments [14], designed in full but deferred to future work;</w:t>
       </w:r>
     </w:p>
     <w:p>
@@ -395,7 +395,7 @@
           <w:sz-cs w:val="24"/>
           <w:spacing w:val="0"/>
         </w:rPr>
-        <w:t xml:space="preserve">analysis of the results and formulation of memory-design recommendations for interlocutor systems.</w:t>
+        <w:t xml:space="preserve">a proof-of-concept implementation and its technical and simulated evaluation, with memory-design recommendations for interlocutor systems to be confirmed by the deferred study.</w:t>
       </w:r>
     </w:p>
     <w:p>
@@ -609,7 +609,78 @@
           <w:sz-cs w:val="24"/>
           <w:spacing w:val="0"/>
         </w:rPr>
-        <w:t xml:space="preserve">Of the three properties by which §1.5 distinguishes an interlocutor from an assistant, the A/B/C memory manipulation bears on context persistence and identity continuity; the third — initiative — is operationalized only in the optional proactive condition (D) and is therefore tested only if that condition is included.</w:t>
+        <w:t xml:space="preserve">The comparison additionally includes a </w:t>
+      </w:r>
+      <w:r>
+        <w:rPr>
+          <w:rFonts w:ascii="Times" w:hAnsi="Times" w:cs="Times"/>
+          <w:sz w:val="24"/>
+          <w:sz-cs w:val="24"/>
+          <w:b/>
+          <w:spacing w:val="0"/>
+        </w:rPr>
+        <w:t xml:space="preserve">curated-static active control (B+)</w:t>
+      </w:r>
+      <w:r>
+        <w:rPr>
+          <w:rFonts w:ascii="Times" w:hAnsi="Times" w:cs="Times"/>
+          <w:sz w:val="24"/>
+          <w:sz-cs w:val="24"/>
+          <w:spacing w:val="0"/>
+        </w:rPr>
+        <w:t xml:space="preserve">: a memory that receives the same offline curation as C but none of its human-memory dynamics (no decay, no salience-gating, no consolidation). The contrast </w:t>
+      </w:r>
+      <w:r>
+        <w:rPr>
+          <w:rFonts w:ascii="Times" w:hAnsi="Times" w:cs="Times"/>
+          <w:sz w:val="24"/>
+          <w:sz-cs w:val="24"/>
+          <w:b/>
+          <w:spacing w:val="0"/>
+        </w:rPr>
+        <w:t xml:space="preserve">C versus B+</w:t>
+      </w:r>
+      <w:r>
+        <w:rPr>
+          <w:rFonts w:ascii="Times" w:hAnsi="Times" w:cs="Times"/>
+          <w:sz w:val="24"/>
+          <w:sz-cs w:val="24"/>
+          <w:spacing w:val="0"/>
+        </w:rPr>
+        <w:t xml:space="preserve"> — which isolates the effect of the human-memory dynamics from the mere legibility gains of curation — is the central novel comparison of this thesis; as established in §3.1, it is by construction a small effect and is treated as a pre-registered </w:t>
+      </w:r>
+      <w:r>
+        <w:rPr>
+          <w:rFonts w:ascii="Times" w:hAnsi="Times" w:cs="Times"/>
+          <w:sz w:val="24"/>
+          <w:sz-cs w:val="24"/>
+          <w:i/>
+          <w:spacing w:val="0"/>
+        </w:rPr>
+        <w:t xml:space="preserve">estimation target</w:t>
+      </w:r>
+      <w:r>
+        <w:rPr>
+          <w:rFonts w:ascii="Times" w:hAnsi="Times" w:cs="Times"/>
+          <w:sz w:val="24"/>
+          <w:sz-cs w:val="24"/>
+          <w:spacing w:val="0"/>
+        </w:rPr>
+        <w:t xml:space="preserve"> rather than a confirmatory test, distinct from the better-powered comparisons (C vs A, and directional B+ vs B and C vs B).</w:t>
+      </w:r>
+    </w:p>
+    <w:p>
+      <w:pPr>
+        <w:spacing w:after="240"/>
+      </w:pPr>
+      <w:r>
+        <w:rPr>
+          <w:rFonts w:ascii="Times" w:hAnsi="Times" w:cs="Times"/>
+          <w:sz w:val="24"/>
+          <w:sz-cs w:val="24"/>
+          <w:spacing w:val="0"/>
+        </w:rPr>
+        <w:t xml:space="preserve">Of the three properties by which §1.5 distinguishes an interlocutor from an assistant, the memory manipulation bears on context persistence and identity continuity; the third — initiative — is operationalized only in an optional proactive condition and is therefore tested only if that condition is included.</w:t>
       </w:r>
     </w:p>
     <w:p>
@@ -726,7 +797,7 @@
           <w:sz-cs w:val="24"/>
           <w:spacing w:val="0"/>
         </w:rPr>
-        <w:t xml:space="preserve">a working voice interlocutor system with a long-term memory module — built on the Voice Companion platform developed by us;</w:t>
+        <w:t xml:space="preserve">a proof-of-concept memory harness implementing all four conditions over multi-session dialogue, together with a specified path to integrate it into the Voice Companion voice platform (future work);</w:t>
       </w:r>
     </w:p>
     <w:p>
@@ -752,7 +823,7 @@
           <w:sz-cs w:val="24"/>
           <w:spacing w:val="0"/>
         </w:rPr>
-        <w:t xml:space="preserve">empirically grounded design recommendations on which memory mechanisms strengthen, and which weaken, user trust and the sense of relationship — a useful guide for builders of conversational products;</w:t>
+        <w:t xml:space="preserve">design recommendations — informed by a technical and simulated proof-of-concept, and to be empirically validated by the deferred human study — on which memory mechanisms strengthen or weaken the sense of relationship, as a guide for builders of conversational products;</w:t>
       </w:r>
     </w:p>
     <w:p>
@@ -821,7 +892,7 @@
           <w:sz-cs w:val="24"/>
           <w:spacing w:val="0"/>
         </w:rPr>
-        <w:t xml:space="preserve">The theoretical contribution of the work is threefold. First, it connects the memory theories of cognitive psychology with the engineering of LLM systems not at the level of metaphor but at the level of measurable behavioral signatures. Second, in the literature available to us no controlled study could be found that compares architectures grounded in different theories of human memory with respect to user-perceived social constructs — existing comparisons are confined to factual-accuracy metrics [1, 2], while perception studies treat memory as an isolated manipulation on a single system [11]; the present work aims precisely at filling this gap by means of a controlled experiment. Third, the work proposes an operationalization of the distinction between an "assistant" and an "interlocutor" on the basis of three measurable properties — context persistence, identity continuity, and initiative — thereby transforming these notions from loosely defined terms into measurable categories.</w:t>
+        <w:t xml:space="preserve">The theoretical contribution of the work is threefold. First, it connects the memory theories of cognitive psychology with the engineering of LLM systems not at the level of metaphor but at the level of measurable behavioral signatures. Second, in the literature available to us no controlled study could be found that compares architectures grounded in different theories of human memory with respect to user-perceived social constructs — existing comparisons are confined to factual-accuracy metrics [1, 2], while perception studies treat memory as an isolated manipulation on a single system [11]; the present work aims to fill this gap by designing a controlled experiment and building the apparatus and methodology to run it. Third, the work proposes an operationalization of the distinction between an "assistant" and an "interlocutor" on the basis of three measurable properties — context persistence, identity continuity, and initiative — thereby transforming these notions from loosely defined terms into measurable categories.</w:t>
       </w:r>
     </w:p>
     <w:p>
@@ -850,7 +921,7 @@
           <w:sz-cs w:val="24"/>
           <w:spacing w:val="0"/>
         </w:rPr>
-        <w:t xml:space="preserve">The work consists of five chapters: introduction, literature review, research methods, results and discussion, and conclusion. The literature review analyzes existing approaches to long-term conversational memory, their cognitive-theoretical foundations, and the limitations of evaluation methodology. The methods chapter describes the developed architecture, the experimental profiles, and the design of the user study. The results chapter presents the quantitative and qualitative analysis, and the conclusion summarizes the findings and outlines directions for future research.</w:t>
+        <w:t xml:space="preserve">The work consists of five chapters: introduction, literature review, research methods, results and discussion, and conclusion. The literature review analyzes existing approaches to long-term conversational memory, their cognitive-theoretical foundations, and the limitations of evaluation methodology. The methods chapter describes the developed architecture, the experimental profiles, the proof-of-concept, and the design of the (deferred) user study. The results chapter reports the proof-of-concept implementation and its technical and simulated evaluation and discusses what they do and do not establish; the human-subject study is specified in the methods chapter as future work. The conclusion summarizes the findings and outlines directions for future research.</w:t>
       </w:r>
     </w:p>
     <w:p>
@@ -979,7 +1050,7 @@
           <w:sz-cs w:val="24"/>
           <w:spacing w:val="0"/>
         </w:rPr>
-        <w:t xml:space="preserve"> Atkinson and Shiffrin's modal model [20] partitions memory into sensory, short-term, and long-term stores, with information transferred between them by control processes, of which rehearsal is the most important: material that is rehearsed passes into durable long-term storage, while unrehearsed material decays. Its behavioral signature is a sharp asymmetry between what was merely heard and what was attended to and repeated — a partner built on this principle would retain emphasized or revisited information and lose what passed once and unremarked.</w:t>
+        <w:t xml:space="preserve"> On Atkinson and Shiffrin's account [20], memory forms a chain of three stores — sensory, short-term, and long-term — through which content moves only when control processes act on it; rehearsal is the decisive one, ushering attended material into durable storage while whatever passes unrehearsed simply fades. Its behavioral signature is a sharp asymmetry between what was merely heard and what was attended to and repeated — a partner built on this principle would retain emphasized or revisited information and lose what passed once and unremarked.</w:t>
       </w:r>
     </w:p>
     <w:p>
@@ -1003,7 +1074,7 @@
           <w:sz-cs w:val="24"/>
           <w:spacing w:val="0"/>
         </w:rPr>
-        <w:t xml:space="preserve"> Baddeley and Hitch [21] refined the short-term store into an active working memory of limited capacity, comprising subsystems coordinated by a central executive. For a conversational agent the relevant signature is intra-turn: only a few items can be held in active manipulation at once, which bears directly on the latency-bounded "working set" a voice agent can reason over before it must consult longer-term storage.</w:t>
+        <w:t xml:space="preserve"> Baddeley and Hitch [21] recast the passive short-term store as an active, capacity-limited working memory whose specialized subsystems are marshalled by a central executive. For a conversational agent the relevant signature is intra-turn: only a few items can be held in active manipulation at once, which bears directly on the latency-bounded "working set" a voice agent can reason over before it must consult longer-term storage.</w:t>
       </w:r>
     </w:p>
     <w:p>
@@ -1027,7 +1098,7 @@
           <w:sz-cs w:val="24"/>
           <w:spacing w:val="0"/>
         </w:rPr>
-        <w:t xml:space="preserve"> Tulving [22] separated episodic memory — the recollection of specific events located in subjective time ("last Tuesday you mentioned your deadline") — from semantic memory, the store of decontextualized facts ("you work under deadlines"). The distinction is foundational for the present work because the two systems produce visibly different conversational behavior: an episodic partner recalls particular moments, while a semantic partner has distilled them into stable knowledge about the user. The transformation of the former into the latter — consolidation — is exactly the process a long-lived interlocutor system must perform to avoid drowning in undigested episodes.</w:t>
+        <w:t xml:space="preserve"> Tulving [22] drew a line between remembering a particular happening one can place in one's own past ("last Tuesday you mentioned your deadline") and merely knowing a fact stripped of its original occasion ("you work under deadlines") — episodic versus semantic memory. The distinction is foundational for the present work because the two systems produce visibly different conversational behavior: an episodic partner recalls particular moments, while a semantic partner has distilled them into stable knowledge about the user. The transformation of the former into the latter — consolidation — is exactly the process a long-lived interlocutor system must perform to avoid drowning in undigested episodes.</w:t>
       </w:r>
     </w:p>
     <w:p>
@@ -1051,7 +1122,7 @@
           <w:sz-cs w:val="24"/>
           <w:spacing w:val="0"/>
         </w:rPr>
-        <w:t xml:space="preserve"> Ebbinghaus's nineteenth-century studies [23] established that retention declines as a roughly exponential function of elapsed time since last rehearsal, and that re-exposure (spaced repetition) flattens the curve. We adopt the forgetting curve with a clear caveat, anticipating an obvious objection: Ebbinghaus measured a single subject on nonsense syllables, and its ecological validity for semantically rich dialogue is limited. The present work therefore does not claim cognitive fidelity; it treats graceful, time-and-salience-dependent decay as an engineering-useful behavioral form, whose effect on user perception — not its psychological accuracy — is the object of study. Its signature is the graceful fading of unrepeated detail and the strengthening of what recurs.</w:t>
+        <w:t xml:space="preserve"> Ebbinghaus's nineteenth-century experiments [23] found that memory strength falls off approximately exponentially with the time since something was last rehearsed, and that spaced re-exposure blunts that decline. We adopt the forgetting curve with a clear caveat, anticipating an obvious objection: Ebbinghaus measured a single subject on nonsense syllables, and its ecological validity for semantically rich dialogue is limited. The present work therefore does not claim cognitive fidelity; it treats graceful, time-and-salience-dependent decay as an engineering-useful behavioral form, whose effect on user perception — not its psychological accuracy — is the object of study. Its signature is the graceful fading of unrepeated detail and the strengthening of what recurs.</w:t>
       </w:r>
     </w:p>
     <w:p>
@@ -1075,7 +1146,7 @@
           <w:sz-cs w:val="24"/>
           <w:spacing w:val="0"/>
         </w:rPr>
-        <w:t xml:space="preserve"> Reyna and Brainerd [24] argued that people encode experience along two parallel traces: a </w:t>
+        <w:t xml:space="preserve"> Reyna and Brainerd [24] hold that any experience leaves two independent imprints at once — a literal record of its surface form (</w:t>
       </w:r>
       <w:r>
         <w:rPr>
@@ -1094,7 +1165,7 @@
           <w:sz-cs w:val="24"/>
           <w:spacing w:val="0"/>
         </w:rPr>
-        <w:t xml:space="preserve"> trace of surface detail and a </w:t>
+        <w:t xml:space="preserve">) and a bottom-line record of its meaning (</w:t>
       </w:r>
       <w:r>
         <w:rPr>
@@ -1113,7 +1184,7 @@
           <w:sz-cs w:val="24"/>
           <w:spacing w:val="0"/>
         </w:rPr>
-        <w:t xml:space="preserve"> trace of meaning, with gist proving more durable and more often driving judgment. This distinction bears directly on our research question: the verbatim/gist contrast maps onto a central empirical finding reviewed below — that literal, word-for-word recall by a chatbot can feel intrusive where paraphrased, gist-level recall does not [11]. A partner that remembers the meaning of what you said rather than your exact words exhibits a recognizably human signature, and one that may sidestep the discomfort of total recall.</w:t>
+        <w:t xml:space="preserve">) — of which the latter lasts longer and more often steers judgment. This distinction bears directly on our research question: the verbatim/gist contrast maps onto a central empirical finding reviewed below — that literal, word-for-word recall by a chatbot can feel intrusive where paraphrased, gist-level recall does not [11]. A partner that remembers the meaning of what you said rather than your exact words exhibits a recognizably human signature, and one that may sidestep the discomfort of total recall.</w:t>
       </w:r>
     </w:p>
     <w:p>
@@ -1137,7 +1208,7 @@
           <w:sz-cs w:val="24"/>
           <w:spacing w:val="0"/>
         </w:rPr>
-        <w:t xml:space="preserve"> Two neurocognitive theories describe how episodic experience becomes durable knowledge. The complementary learning systems framework [25] posits a fast-learning hippocampal system that rapidly captures specific episodes and a slow-learning neocortical system that gradually extracts regularities, with offline replay transferring knowledge from the former to the latter. The hippocampal memory indexing theory [26] casts the hippocampus not as the store of memories themselves but as an index of pointers to neocortical traces, enabling reconstruction of a full memory from a partial cue. Both predict the same high-level behavioral signature — an agent that captures episodes quickly but reorganizes them into structured knowledge during periods away from interaction — and both, as §2.4 shows, have direct computational descendants.</w:t>
+        <w:t xml:space="preserve"> Two neurocognitive theories describe how episodic experience becomes durable knowledge. On the complementary learning systems account [25], one system centred on the hippocampus grabs individual episodes quickly while a second, cortical system distils recurring structure only slowly, with offline replay ferrying what was captured into that slower store. The indexing theory [26] adds that the hippocampus need not hold the memories at all — it holds pointers back to the cortical patterns that composed them, so that a fragment of a cue can pull an entire memory back together. Both predict the same high-level behavioral signature — an agent that captures episodes quickly but reorganizes them into structured knowledge during periods away from interaction — and both, as §2.4 shows, have direct computational descendants.</w:t>
       </w:r>
     </w:p>
     <w:p>
@@ -1204,7 +1275,7 @@
           <w:sz-cs w:val="24"/>
           <w:spacing w:val="0"/>
         </w:rPr>
-        <w:t xml:space="preserve"> The first systems treated the bounded context window as the constraint to be managed. MemGPT [17] drew an explicit analogy to operating-system virtual memory: the model issues function calls to page information between an in-context "core" memory and out-of-context archival and recall tiers, managing its own memory hierarchy. In parallel, two systems looked to human memory for inspiration. The Generative Agents architecture [10] introduced the now-canonical "memory stream": a chronological natural-language log of observations. Its entries are scored at retrieval time by a weighted combination of recency (an exponential decay), importance (an LLM-assigned salience rating), and relevance (embedding similarity), and periodic "reflection" steps synthesize higher-level observations from them. It is important to record precisely what this is and is not: the retrieval score is reminiscent of activation-based theories such as ACT-R, but it is the authors' own engineering construction and is not derived from any cognitive model — a distinction we preserve to avoid overstating the theoretical lineage. MemoryBank [6], by contrast, grounded itself explicitly in the Ebbinghaus forgetting curve, modeling each memory's strength as an exponential function of elapsed time that is reinforced on re-access; it powered SiliconFriend, a long-term "companion" chatbot and the closest direct precedent for the present work (closest by a stated criterion: a system in the so-called "companion" genre whose memory is grounded in a human-memory theory).</w:t>
+        <w:t xml:space="preserve"> The first systems treated the bounded context window as the constraint to be managed. MemGPT [17] borrows the operating system's idea of virtual memory: through function calls the model itself moves information between an in-context "core" store and larger out-of-context archival and recall tiers, administering its own hierarchy. In parallel, two systems looked to human memory for inspiration. The Generative Agents architecture [10] introduced the now-canonical "memory stream": a chronological natural-language log of observations. When the store is queried, each entry is ranked by blending three factors — how recently it was accessed (an exponential decay), how important the model judged it (an LLM-assigned rating), and how relevant it is to the query (embedding similarity) — while periodic "reflection" steps distil higher-level observations from the log. It is important to record precisely what this is and is not: the retrieval score is reminiscent of activation-based theories such as ACT-R, but it is the authors' own engineering construction and is not derived from any cognitive model — a distinction we preserve to avoid overstating the theoretical lineage. MemoryBank [6], by contrast, grounded itself explicitly in the Ebbinghaus forgetting curve, modeling each memory's strength as an exponential function of elapsed time that is reinforced on re-access; it powered SiliconFriend, a long-term "companion" chatbot and the closest direct precedent for the present work (closest by a stated criterion: a system in the so-called "companion" genre whose memory is grounded in a human-memory theory).</w:t>
       </w:r>
     </w:p>
     <w:p>
@@ -1228,7 +1299,7 @@
           <w:sz-cs w:val="24"/>
           <w:spacing w:val="0"/>
         </w:rPr>
-        <w:t xml:space="preserve"> The second wave moved from research prototypes toward deployable memory services and toward retrieval mechanisms borrowed from neuroscience. Mem0 [29] implements a memory layer that extracts salient facts from dialogue and incrementally updates a consolidated store; its authors report sizable gains over a strong baseline on conversational-memory tasks together with substantial reductions in latency and token cost. Zep [30], built on the Graphiti temporally-aware knowledge-graph engine, represents memory as a bi-temporal graph that tracks both when an event occurred and when it was recorded; its authors likewise report accuracy improvements alongside large latency reductions on long-memory evaluation (these vendor-reported figures should be read against the benchmark-reliability concerns of §2.5). Both mark the wave's defining shift — from merely logging episodes, as in wave one, toward maintaining a continuously consolidated store — and both foreground latency and cost, signalling the move from research prototype to production service. Two systems of this wave are of particular theoretical interest. HippoRAG [7] operationalizes the hippocampal memory indexing theory directly: it casts the LLM as neocortex, retrieval encoders as the parahippocampal region, and a knowledge graph traversed by Personalized PageRank as the hippocampal index, achieving multi-hop retrieval through graph search. EM-LLM [8] grounds itself in human episodic memory and in event-segmentation theory [31], dividing a token stream into discrete events at boundaries detected by Bayesian "surprise" and retrieving them through a combination of similarity-based and temporally-contiguous access. Also of this period, ReadAgent [9] operationalizes fuzzy-trace theory: it paginates a long context into episodes and replaces their verbatim text with LLM-generated gist summaries, retrieving the detail only when a task demands it. A further notable system, A-MEM [27], organizes memories as an interlinked network of notes that the agent itself extends and revises; we flag, however, that it is grounded in the Zettelkasten note-taking method, which is an information-organization practice and not a theory of human memory — a distinction relevant to our specific framing.</w:t>
+        <w:t xml:space="preserve"> The second wave moved from research prototypes toward deployable memory services and toward retrieval mechanisms borrowed from neuroscience. Mem0 [29] implements a memory layer that extracts salient facts from dialogue and incrementally updates a consolidated store; its authors report sizable gains over a strong baseline on conversational-memory tasks together with substantial reductions in latency and token cost. Zep [30], built on the Graphiti temporally-aware knowledge-graph engine, represents memory as a bi-temporal graph that tracks both when an event occurred and when it was recorded; its authors likewise report accuracy improvements alongside large latency reductions on long-memory evaluation (these vendor-reported figures should be read against the benchmark-reliability concerns of §2.5). Both mark the wave's defining shift — from merely logging episodes, as in wave one, toward maintaining a continuously consolidated store — and both foreground latency and cost, signalling the move from research prototype to production service. Two systems of this wave are of particular theoretical interest. HippoRAG [7] operationalizes the hippocampal memory indexing theory directly: it casts the LLM as neocortex, retrieval encoders as the parahippocampal region, and a knowledge graph traversed by Personalized PageRank as the hippocampal index, achieving multi-hop retrieval through graph search. EM-LLM [8] grounds itself in human episodic memory and in event-segmentation theory [31], dividing a token stream into discrete events at boundaries detected by Bayesian "surprise" and retrieving them through a combination of similarity-based and temporally-contiguous access. From the same period, ReadAgent [9] puts the gist idea to work: it breaks a long context into episode-sized pages, keeps only an LLM-written gist of each, and returns to the underlying text solely when a task requires the detail. A further notable system, A-MEM [27], organizes memories as an interlinked network of notes that the agent itself extends and revises; we flag, however, that it is grounded in the Zettelkasten note-taking method, which is an information-organization practice and not a theory of human memory — a distinction relevant to our specific framing.</w:t>
       </w:r>
     </w:p>
     <w:p>

</xml_diff>